<commit_message>
Daily iteration 2026-06-02: Processed 7 queue items (ABA-201, Ver-A-T1D, Tegoprubart, PROTECT ext, DAPAN-DIA, SAB-142, BANDIT 2yr) via web search; no new peer-reviewed pubs identified; rescheduled checks. Credibility clean; pipeline 41/41 [OK].
</commit_message>
<xml_diff>
--- a/Platform_Audit_Report.docx
+++ b/Platform_Audit_Report.docx
@@ -3,10 +3,14 @@
 <w:document xmlns:wpc="http://schemas.microsoft.com/office/word/2010/wordprocessingCanvas" xmlns:mo="http://schemas.microsoft.com/office/mac/office/2008/main" xmlns:mc="http://schemas.openxmlformats.org/markup-compatibility/2006" xmlns:mv="urn:schemas-microsoft-com:mac:vml" xmlns:o="urn:schemas-microsoft-com:office:office" xmlns:r="http://schemas.openxmlformats.org/officeDocument/2006/relationships" xmlns:m="http://schemas.openxmlformats.org/officeDocument/2006/math" xmlns:v="urn:schemas-microsoft-com:vml" xmlns:wp14="http://schemas.microsoft.com/office/word/2010/wordprocessingDrawing" xmlns:wp="http://schemas.openxmlformats.org/drawingml/2006/wordprocessingDrawing" xmlns:w10="urn:schemas-microsoft-com:office:word" xmlns:w="http://schemas.openxmlformats.org/wordprocessingml/2006/main" xmlns:w14="http://schemas.microsoft.com/office/word/2010/wordml" xmlns:wpg="http://schemas.microsoft.com/office/word/2010/wordprocessingGroup" xmlns:wpi="http://schemas.microsoft.com/office/word/2010/wordprocessingInk" xmlns:wne="http://schemas.microsoft.com/office/word/2006/wordml" xmlns:wps="http://schemas.microsoft.com/office/word/2010/wordprocessingShape" mc:Ignorable="w14 wp14">
   <w:body>
     <w:p>
+      <w:pPr>
+        <w:jc w:val="left"/>
+      </w:pPr>
       <w:r>
         <w:rPr>
-          <w:b w:val="0"/>
-          <w:sz w:val="44"/>
+          <w:rFonts w:ascii="Georgia" w:hAnsi="Georgia"/>
+          <w:color w:val="1A1A1A"/>
+          <w:sz w:val="48"/>
         </w:rPr>
         <w:t>Diabetes Research Hub</w:t>
       </w:r>
@@ -14,9 +18,10 @@
     <w:p>
       <w:r>
         <w:rPr>
+          <w:rFonts w:ascii="Georgia" w:hAnsi="Georgia"/>
           <w:i/>
           <w:color w:val="636363"/>
-          <w:sz w:val="28"/>
+          <w:sz w:val="32"/>
         </w:rPr>
         <w:t>Weekly Platform Audit Report</w:t>
       </w:r>
@@ -27,7 +32,7 @@
           <w:color w:val="636363"/>
           <w:sz w:val="22"/>
         </w:rPr>
-        <w:t>May 24, 2026</w:t>
+        <w:t>May 31, 2026 — One week after the May 24 audit</w:t>
       </w:r>
     </w:p>
     <w:p/>
@@ -36,60 +41,42 @@
         <w:pStyle w:val="Heading1"/>
       </w:pPr>
       <w:r>
+        <w:rPr>
+          <w:rFonts w:ascii="Georgia" w:hAnsi="Georgia"/>
+          <w:color w:val="1A1A1A"/>
+        </w:rPr>
         <w:t>Executive Summary</w:t>
       </w:r>
     </w:p>
     <w:p>
       <w:r>
-        <w:rPr>
-          <w:b w:val="0"/>
-          <w:i w:val="0"/>
-        </w:rPr>
-        <w:t>This audit covers the Diabetes Research Hub on May 24, 2026, exactly one week after the May 17 audit. The platform comprises 34 active dashboards (3.7 MB working copy under Dashboards/, 3.2 MB mirror under docs/Dashboards/), a Tufte-styled landing page at docs/index.html dated 2026-05-24, and 41 build scripts under Analysis/Scripts/ referenced by the master runner run_quality_improvements.py.</w:t>
+        <w:t>This audit covers the Diabetes Research Hub on May 31, 2026. The platform consists of 34 dashboards in the working copy under Dashboards/, a Tufte-styled landing page at docs/index.html dated 2026-05-31, and 41 build scripts under Analysis/Scripts/ orchestrated by run_quality_improvements.py.</w:t>
       </w:r>
     </w:p>
     <w:p>
       <w:r>
-        <w:rPr>
-          <w:b w:val="0"/>
-          <w:i w:val="0"/>
-        </w:rPr>
-        <w:t>Direction of travel this week is mixed. A new high-priority build failure has appeared: add_citations.py — newly added to the master runner since the May 17 audit — fails with an IndentationError at line 268 (duplicate code block following main()). The master runner now reports "1 script(s) failed" at the end of every full build. Everything else in the pipeline still passes, and the dashboards regenerate cleanly, but the headline build status has flipped from green to amber.</w:t>
+        <w:t>Direction of travel this week is mixed. The good news: last week's HIGH-priority add_citations.py IndentationError has been resolved — the master runner now exits all-green with all 41 scripts passing. The bad news: a much larger deployment problem has come into focus. The docs/Dashboards/ mirror that serves the GitHub Pages site is not just missing one file — every dashboard in it is stale, dated March 29, 2026. None of the navigation, back-links, ARIA work, or PMID hyperlinks added by postprocess_dashboards.py over the past two months has reached the deployed site. What the May 24 audit framed as a one-line cp fix is in fact a wholesale deploy-step regression.</w:t>
       </w:r>
     </w:p>
     <w:p>
       <w:r>
-        <w:rPr>
-          <w:b w:val="0"/>
-          <w:i w:val="0"/>
-        </w:rPr>
-        <w:t>The Islet_Drug_Repurposing.html mirror gap that the May 10 and May 17 audits flagged HIGH remains unresolved: the landing page links to it, docs/Dashboards/ still does not contain it, and the GitHub Pages mirror still returns 404. Clinical-trial headline drift across the site also persists: the landing page incremented from 795 to 797 this week, but the prose embeddings in Clinical_Trial_Dashboard.html ("748+"), Gap_Deep_Dives.html (two occurrences of "746"), and docs/social_media_launch_posts.md (three occurrences of "746") did not move.</w:t>
+        <w:t>Three carryovers persist unchanged: the seven sentence-as-PMID hrefs in Drug_Repurposing_Islet.html, the JavaScript template-literal leak in Generic_Drug_Catalog.html, and the hardcoded 'Generated 2025' footer in GKA_Landscape.html. Trial-count drift has widened, not narrowed: the landing page incremented from 797 to 804 this week, while Clinical_Trial_Dashboard prose ('748+'), Gap_Deep_Dives ('746-trial database'), and the social-media post drafts ('746') did not move. The audit task description itself still references 746, which is now four weeks stale.</w:t>
       </w:r>
     </w:p>
     <w:p>
       <w:r>
-        <w:rPr>
-          <w:b w:val="0"/>
-          <w:i w:val="0"/>
-        </w:rPr>
-        <w:t>On the positive side, extract_corpus_data.py — flagged LOW for an IndentationError on May 17 — now compiles cleanly. CONTRIBUTING.md, the four GitHub issue templates, and the APA/BibTeX citation block under "Citing This Work" are all in place and unchanged. Navigation coverage is complete: all 34 dashboards carry a &lt;nav&gt; element and a back-link to the hub, and all 34 landing-page hrefs resolve against the working copy.</w:t>
-      </w:r>
-    </w:p>
-    <w:p>
-      <w:r>
-        <w:rPr>
-          <w:b w:val="0"/>
-          <w:i w:val="0"/>
-        </w:rPr>
-        <w:t>Net assessment: working-copy build integrity is intact dashboard-by-dashboard, but the master runner's exit summary is no longer all-green, and the same three carryover surface issues (mirror gap, trial-count drift, hardcoded "Generated 2025" footer in GKA_Landscape.html) continue to age in place. One new HIGH (add_citations.py), one HIGH carryover (Islet mirror), three MEDIUM, six LOW.</w:t>
+        <w:t>Net assessment: working-copy quality is the strongest it has been in any audit cycle to date — every dashboard carries nav, back-link, and adequate ARIA, and the master pipeline is green for the first time since May 17. But none of that quality is reaching users. One new HIGH (docs/Dashboards/ mirror entirely stale), one HIGH carryover (Islet_Drug_Repurposing missing from mirror — now in its 4th audit cycle), four MEDIUM, six LOW.</w:t>
       </w:r>
     </w:p>
     <w:p>
       <w:pPr>
         <w:pStyle w:val="Heading2"/>
-        <w:spacing w:before="280"/>
       </w:pPr>
       <w:r>
+        <w:rPr>
+          <w:rFonts w:ascii="Georgia" w:hAnsi="Georgia"/>
+          <w:color w:val="1A1A1A"/>
+        </w:rPr>
         <w:t>Summary metrics</w:t>
       </w:r>
     </w:p>
@@ -110,10 +97,7 @@
           </w:tcPr>
           <w:p>
             <w:r>
-              <w:rPr>
-                <w:sz w:val="20"/>
-              </w:rPr>
-              <w:t>Active dashboards</w:t>
+              <w:t>Active dashboards (working copy)</w:t>
             </w:r>
           </w:p>
         </w:tc>
@@ -123,9 +107,6 @@
           </w:tcPr>
           <w:p>
             <w:r>
-              <w:rPr>
-                <w:sz w:val="20"/>
-              </w:rPr>
               <w:t>34</w:t>
             </w:r>
           </w:p>
@@ -138,10 +119,7 @@
           </w:tcPr>
           <w:p>
             <w:r>
-              <w:rPr>
-                <w:sz w:val="20"/>
-              </w:rPr>
-              <w:t>HIGH-priority items</w:t>
+              <w:t>Dashboards in deployed mirror (docs/Dashboards/)</w:t>
             </w:r>
           </w:p>
         </w:tc>
@@ -151,10 +129,7 @@
           </w:tcPr>
           <w:p>
             <w:r>
-              <w:rPr>
-                <w:sz w:val="20"/>
-              </w:rPr>
-              <w:t>2 (1 new, 1 carryover)</w:t>
+              <w:t>33 (1 missing)</w:t>
             </w:r>
           </w:p>
         </w:tc>
@@ -166,10 +141,7 @@
           </w:tcPr>
           <w:p>
             <w:r>
-              <w:rPr>
-                <w:sz w:val="20"/>
-              </w:rPr>
-              <w:t>MEDIUM-priority items</w:t>
+              <w:t>Mirror staleness</w:t>
             </w:r>
           </w:p>
         </w:tc>
@@ -179,10 +151,7 @@
           </w:tcPr>
           <w:p>
             <w:r>
-              <w:rPr>
-                <w:sz w:val="20"/>
-              </w:rPr>
-              <w:t>3</w:t>
+              <w:t>All 33 dated 2026-03-29 (~9 weeks stale)</w:t>
             </w:r>
           </w:p>
         </w:tc>
@@ -194,10 +163,7 @@
           </w:tcPr>
           <w:p>
             <w:r>
-              <w:rPr>
-                <w:sz w:val="20"/>
-              </w:rPr>
-              <w:t>LOW-priority items</w:t>
+              <w:t>Build scripts in master runner</w:t>
             </w:r>
           </w:p>
         </w:tc>
@@ -207,10 +173,7 @@
           </w:tcPr>
           <w:p>
             <w:r>
-              <w:rPr>
-                <w:sz w:val="20"/>
-              </w:rPr>
-              <w:t>6</w:t>
+              <w:t>41 (all passing this cycle)</w:t>
             </w:r>
           </w:p>
         </w:tc>
@@ -222,10 +185,7 @@
           </w:tcPr>
           <w:p>
             <w:r>
-              <w:rPr>
-                <w:sz w:val="20"/>
-              </w:rPr>
-              <w:t>Dashboards with nav bar</w:t>
+              <w:t>Unique PMIDs across platform</w:t>
             </w:r>
           </w:p>
         </w:tc>
@@ -235,10 +195,7 @@
           </w:tcPr>
           <w:p>
             <w:r>
-              <w:rPr>
-                <w:sz w:val="20"/>
-              </w:rPr>
-              <w:t>34 / 34</w:t>
+              <w:t>186</w:t>
             </w:r>
           </w:p>
         </w:tc>
@@ -250,10 +207,7 @@
           </w:tcPr>
           <w:p>
             <w:r>
-              <w:rPr>
-                <w:sz w:val="20"/>
-              </w:rPr>
-              <w:t>Dashboards with back-link</w:t>
+              <w:t>Total &lt;th&gt; elements / with scope attribute</w:t>
             </w:r>
           </w:p>
         </w:tc>
@@ -263,10 +217,7 @@
           </w:tcPr>
           <w:p>
             <w:r>
-              <w:rPr>
-                <w:sz w:val="20"/>
-              </w:rPr>
-              <w:t>34 / 34</w:t>
+              <w:t>465 / 0</w:t>
             </w:r>
           </w:p>
         </w:tc>
@@ -278,10 +229,7 @@
           </w:tcPr>
           <w:p>
             <w:r>
-              <w:rPr>
-                <w:sz w:val="20"/>
-              </w:rPr>
-              <w:t>Pipeline scripts compiling</w:t>
+              <w:t>Findings: HIGH / MEDIUM / LOW</w:t>
             </w:r>
           </w:p>
         </w:tc>
@@ -291,10 +239,7 @@
           </w:tcPr>
           <w:p>
             <w:r>
-              <w:rPr>
-                <w:sz w:val="20"/>
-              </w:rPr>
-              <w:t>40 / 41</w:t>
+              <w:t>2 / 4 / 6</w:t>
             </w:r>
           </w:p>
         </w:tc>
@@ -306,10 +251,7 @@
           </w:tcPr>
           <w:p>
             <w:r>
-              <w:rPr>
-                <w:sz w:val="20"/>
-              </w:rPr>
-              <w:t>Pipeline scripts failing</w:t>
+              <w:t>Change vs. May 24</w:t>
             </w:r>
           </w:p>
         </w:tc>
@@ -319,426 +261,37 @@
           </w:tcPr>
           <w:p>
             <w:r>
-              <w:rPr>
-                <w:sz w:val="20"/>
-              </w:rPr>
-              <w:t>1 / 41 (add_citations.py)</w:t>
-            </w:r>
-          </w:p>
-        </w:tc>
-      </w:tr>
-      <w:tr>
-        <w:tc>
-          <w:tcPr>
-            <w:tcW w:type="dxa" w:w="4680"/>
-          </w:tcPr>
-          <w:p>
-            <w:r>
-              <w:rPr>
-                <w:sz w:val="20"/>
-              </w:rPr>
-              <w:t>Unique PMIDs in Paper_Library / PMID_Verification</w:t>
-            </w:r>
-          </w:p>
-        </w:tc>
-        <w:tc>
-          <w:tcPr>
-            <w:tcW w:type="dxa" w:w="4680"/>
-          </w:tcPr>
-          <w:p>
-            <w:r>
-              <w:rPr>
-                <w:sz w:val="20"/>
-              </w:rPr>
-              <w:t>259</w:t>
-            </w:r>
-          </w:p>
-        </w:tc>
-      </w:tr>
-      <w:tr>
-        <w:tc>
-          <w:tcPr>
-            <w:tcW w:type="dxa" w:w="4680"/>
-          </w:tcPr>
-          <w:p>
-            <w:r>
-              <w:rPr>
-                <w:sz w:val="20"/>
-              </w:rPr>
-              <w:t>Working-copy total size</w:t>
-            </w:r>
-          </w:p>
-        </w:tc>
-        <w:tc>
-          <w:tcPr>
-            <w:tcW w:type="dxa" w:w="4680"/>
-          </w:tcPr>
-          <w:p>
-            <w:r>
-              <w:rPr>
-                <w:sz w:val="20"/>
-              </w:rPr>
-              <w:t>3.7 MB</w:t>
+              <w:t>+1 HIGH (new), 0 HIGH closed; +1 MEDIUM; -0 LOW</w:t>
             </w:r>
           </w:p>
         </w:tc>
       </w:tr>
     </w:tbl>
+    <w:p/>
     <w:p>
-      <w:pPr>
-        <w:pStyle w:val="Heading2"/>
-        <w:spacing w:before="280"/>
-      </w:pPr>
       <w:r>
-        <w:t>Comparison to Previous Audit (May 17, 2026)</w:t>
+        <w:rPr>
+          <w:b w:val="0"/>
+          <w:i/>
+          <w:sz w:val="20"/>
+        </w:rPr>
+        <w:t>Comparison to Previous Audit (May 24, 2026). Last week's audit logged 1 new HIGH (add_citations.py IndentationError, now closed), 1 HIGH carryover (Islet_Drug_Repurposing missing from docs/Dashboards/, still open and now in its 4th cycle), 3 MEDIUM, and 6 LOW. This week the headline change is that the mirror gap is broader than previously thought — the mirror is not one dashboard short, it is two months out of date entirely.</w:t>
       </w:r>
     </w:p>
     <w:p>
       <w:r>
-        <w:rPr>
-          <w:b w:val="0"/>
-          <w:i w:val="0"/>
-        </w:rPr>
-        <w:t>Last week's audit logged 0 HIGH items in the working copy, 3 MEDIUM, and 4 LOW, with one HIGH carryover for the docs/Dashboards/ mirror gap. Today's audit registers one new HIGH in the pipeline (add_citations.py compile failure) and closes one LOW (extract_corpus_data.py now compiles).</w:t>
+        <w:br w:type="page"/>
       </w:r>
     </w:p>
-    <w:tbl>
-      <w:tblPr>
-        <w:tblStyle w:val="LightGrid-Accent1"/>
-        <w:tblW w:type="auto" w:w="0"/>
-        <w:tblLook w:firstColumn="1" w:firstRow="1" w:lastColumn="0" w:lastRow="0" w:noHBand="0" w:noVBand="1" w:val="04A0"/>
-      </w:tblPr>
-      <w:tblGrid>
-        <w:gridCol w:w="3120"/>
-        <w:gridCol w:w="3120"/>
-        <w:gridCol w:w="3120"/>
-      </w:tblGrid>
-      <w:tr>
-        <w:tc>
-          <w:tcPr>
-            <w:tcW w:type="dxa" w:w="3120"/>
-          </w:tcPr>
-          <w:p>
-            <w:r>
-              <w:t>Item</w:t>
-            </w:r>
-          </w:p>
-        </w:tc>
-        <w:tc>
-          <w:tcPr>
-            <w:tcW w:type="dxa" w:w="3120"/>
-          </w:tcPr>
-          <w:p>
-            <w:r>
-              <w:t>May 17</w:t>
-            </w:r>
-          </w:p>
-        </w:tc>
-        <w:tc>
-          <w:tcPr>
-            <w:tcW w:type="dxa" w:w="3120"/>
-          </w:tcPr>
-          <w:p>
-            <w:r>
-              <w:t>May 24</w:t>
-            </w:r>
-          </w:p>
-        </w:tc>
-      </w:tr>
-      <w:tr>
-        <w:tc>
-          <w:tcPr>
-            <w:tcW w:type="dxa" w:w="3120"/>
-          </w:tcPr>
-          <w:p>
-            <w:r>
-              <w:rPr>
-                <w:sz w:val="19"/>
-              </w:rPr>
-              <w:t>add_citations.py compile</w:t>
-            </w:r>
-          </w:p>
-        </w:tc>
-        <w:tc>
-          <w:tcPr>
-            <w:tcW w:type="dxa" w:w="3120"/>
-          </w:tcPr>
-          <w:p>
-            <w:r>
-              <w:rPr>
-                <w:sz w:val="19"/>
-              </w:rPr>
-              <w:t>not in runner</w:t>
-            </w:r>
-          </w:p>
-        </w:tc>
-        <w:tc>
-          <w:tcPr>
-            <w:tcW w:type="dxa" w:w="3120"/>
-          </w:tcPr>
-          <w:p>
-            <w:r>
-              <w:rPr>
-                <w:sz w:val="19"/>
-              </w:rPr>
-              <w:t>IndentationError @ L268 — NEW</w:t>
-            </w:r>
-          </w:p>
-        </w:tc>
-      </w:tr>
-      <w:tr>
-        <w:tc>
-          <w:tcPr>
-            <w:tcW w:type="dxa" w:w="3120"/>
-          </w:tcPr>
-          <w:p>
-            <w:r>
-              <w:rPr>
-                <w:sz w:val="19"/>
-              </w:rPr>
-              <w:t>extract_corpus_data.py compile</w:t>
-            </w:r>
-          </w:p>
-        </w:tc>
-        <w:tc>
-          <w:tcPr>
-            <w:tcW w:type="dxa" w:w="3120"/>
-          </w:tcPr>
-          <w:p>
-            <w:r>
-              <w:rPr>
-                <w:sz w:val="19"/>
-              </w:rPr>
-              <w:t>IndentationError</w:t>
-            </w:r>
-          </w:p>
-        </w:tc>
-        <w:tc>
-          <w:tcPr>
-            <w:tcW w:type="dxa" w:w="3120"/>
-          </w:tcPr>
-          <w:p>
-            <w:r>
-              <w:rPr>
-                <w:sz w:val="19"/>
-              </w:rPr>
-              <w:t>PASSES — CLOSED</w:t>
-            </w:r>
-          </w:p>
-        </w:tc>
-      </w:tr>
-      <w:tr>
-        <w:tc>
-          <w:tcPr>
-            <w:tcW w:type="dxa" w:w="3120"/>
-          </w:tcPr>
-          <w:p>
-            <w:r>
-              <w:rPr>
-                <w:sz w:val="19"/>
-              </w:rPr>
-              <w:t>Islet_Drug_Repurposing.html mirror</w:t>
-            </w:r>
-          </w:p>
-        </w:tc>
-        <w:tc>
-          <w:tcPr>
-            <w:tcW w:type="dxa" w:w="3120"/>
-          </w:tcPr>
-          <w:p>
-            <w:r>
-              <w:rPr>
-                <w:sz w:val="19"/>
-              </w:rPr>
-              <w:t>missing</w:t>
-            </w:r>
-          </w:p>
-        </w:tc>
-        <w:tc>
-          <w:tcPr>
-            <w:tcW w:type="dxa" w:w="3120"/>
-          </w:tcPr>
-          <w:p>
-            <w:r>
-              <w:rPr>
-                <w:sz w:val="19"/>
-              </w:rPr>
-              <w:t>still missing</w:t>
-            </w:r>
-          </w:p>
-        </w:tc>
-      </w:tr>
-      <w:tr>
-        <w:tc>
-          <w:tcPr>
-            <w:tcW w:type="dxa" w:w="3120"/>
-          </w:tcPr>
-          <w:p>
-            <w:r>
-              <w:rPr>
-                <w:sz w:val="19"/>
-              </w:rPr>
-              <w:t>Landing-page trial count</w:t>
-            </w:r>
-          </w:p>
-        </w:tc>
-        <w:tc>
-          <w:tcPr>
-            <w:tcW w:type="dxa" w:w="3120"/>
-          </w:tcPr>
-          <w:p>
-            <w:r>
-              <w:rPr>
-                <w:sz w:val="19"/>
-              </w:rPr>
-              <w:t>795</w:t>
-            </w:r>
-          </w:p>
-        </w:tc>
-        <w:tc>
-          <w:tcPr>
-            <w:tcW w:type="dxa" w:w="3120"/>
-          </w:tcPr>
-          <w:p>
-            <w:r>
-              <w:rPr>
-                <w:sz w:val="19"/>
-              </w:rPr>
-              <w:t>797</w:t>
-            </w:r>
-          </w:p>
-        </w:tc>
-      </w:tr>
-      <w:tr>
-        <w:tc>
-          <w:tcPr>
-            <w:tcW w:type="dxa" w:w="3120"/>
-          </w:tcPr>
-          <w:p>
-            <w:r>
-              <w:rPr>
-                <w:sz w:val="19"/>
-              </w:rPr>
-              <w:t>Clinical_Trial_Dashboard prose count</w:t>
-            </w:r>
-          </w:p>
-        </w:tc>
-        <w:tc>
-          <w:tcPr>
-            <w:tcW w:type="dxa" w:w="3120"/>
-          </w:tcPr>
-          <w:p>
-            <w:r>
-              <w:rPr>
-                <w:sz w:val="19"/>
-              </w:rPr>
-              <w:t>748+</w:t>
-            </w:r>
-          </w:p>
-        </w:tc>
-        <w:tc>
-          <w:tcPr>
-            <w:tcW w:type="dxa" w:w="3120"/>
-          </w:tcPr>
-          <w:p>
-            <w:r>
-              <w:rPr>
-                <w:sz w:val="19"/>
-              </w:rPr>
-              <w:t>748+ (stale)</w:t>
-            </w:r>
-          </w:p>
-        </w:tc>
-      </w:tr>
-      <w:tr>
-        <w:tc>
-          <w:tcPr>
-            <w:tcW w:type="dxa" w:w="3120"/>
-          </w:tcPr>
-          <w:p>
-            <w:r>
-              <w:rPr>
-                <w:sz w:val="19"/>
-              </w:rPr>
-              <w:t>Gap_Deep_Dives.html prose count</w:t>
-            </w:r>
-          </w:p>
-        </w:tc>
-        <w:tc>
-          <w:tcPr>
-            <w:tcW w:type="dxa" w:w="3120"/>
-          </w:tcPr>
-          <w:p>
-            <w:r>
-              <w:rPr>
-                <w:sz w:val="19"/>
-              </w:rPr>
-              <w:t>746 (two places)</w:t>
-            </w:r>
-          </w:p>
-        </w:tc>
-        <w:tc>
-          <w:tcPr>
-            <w:tcW w:type="dxa" w:w="3120"/>
-          </w:tcPr>
-          <w:p>
-            <w:r>
-              <w:rPr>
-                <w:sz w:val="19"/>
-              </w:rPr>
-              <w:t>746 (two places, stale)</w:t>
-            </w:r>
-          </w:p>
-        </w:tc>
-      </w:tr>
-      <w:tr>
-        <w:tc>
-          <w:tcPr>
-            <w:tcW w:type="dxa" w:w="3120"/>
-          </w:tcPr>
-          <w:p>
-            <w:r>
-              <w:rPr>
-                <w:sz w:val="19"/>
-              </w:rPr>
-              <w:t>GKA_Landscape footer year</w:t>
-            </w:r>
-          </w:p>
-        </w:tc>
-        <w:tc>
-          <w:tcPr>
-            <w:tcW w:type="dxa" w:w="3120"/>
-          </w:tcPr>
-          <w:p>
-            <w:r>
-              <w:rPr>
-                <w:sz w:val="19"/>
-              </w:rPr>
-              <w:t>"Generated 2025"</w:t>
-            </w:r>
-          </w:p>
-        </w:tc>
-        <w:tc>
-          <w:tcPr>
-            <w:tcW w:type="dxa" w:w="3120"/>
-          </w:tcPr>
-          <w:p>
-            <w:r>
-              <w:rPr>
-                <w:sz w:val="19"/>
-              </w:rPr>
-              <w:t>"Generated 2025" (stale)</w:t>
-            </w:r>
-          </w:p>
-        </w:tc>
-      </w:tr>
-    </w:tbl>
     <w:p>
       <w:pPr>
-        <w:pStyle w:val="Heading2"/>
-        <w:spacing w:before="280"/>
+        <w:pStyle w:val="Heading1"/>
       </w:pPr>
       <w:r>
+        <w:rPr>
+          <w:rFonts w:ascii="Georgia" w:hAnsi="Georgia"/>
+          <w:color w:val="1A1A1A"/>
+        </w:rPr>
         <w:t>Dashboard-by-Dashboard Status</w:t>
       </w:r>
     </w:p>
@@ -747,9 +300,9 @@
         <w:rPr>
           <w:b w:val="0"/>
           <w:i/>
-          <w:color w:val="636363"/>
+          <w:sz w:val="20"/>
         </w:rPr>
-        <w:t>All 34 active dashboards, sorted alphabetically. PMIDs is the count of unique numeric PubMed IDs extracted from href attributes — JavaScript-injected citations are not visible to static scans (Generic_Drug_Catalog is the documented example). Nav and Back are presence checks. The Issues column is the highest-severity item raised on that dashboard.</w:t>
+        <w:t>All 34 active dashboards in the working copy, sorted alphabetically. PMIDs is the count of unique numeric PubMed IDs visible to static scan (text-form PMIDs and href-form pubmed URLs). Nav and Back are presence checks against the post-processed working copy — note that none of this is visible on the deployed mirror, which still serves the March 29 versions. The Priority column reflects the highest-severity item raised on that dashboard.</w:t>
       </w:r>
     </w:p>
     <w:tbl>
@@ -771,6 +324,7 @@
         <w:tc>
           <w:tcPr>
             <w:tcW w:type="dxa" w:w="1337"/>
+            <w:shd w:val="clear" w:color="auto" w:fill="E8E5DC"/>
           </w:tcPr>
           <w:p>
             <w:r>
@@ -785,6 +339,7 @@
         <w:tc>
           <w:tcPr>
             <w:tcW w:type="dxa" w:w="1337"/>
+            <w:shd w:val="clear" w:color="auto" w:fill="E8E5DC"/>
           </w:tcPr>
           <w:p>
             <w:r>
@@ -792,13 +347,14 @@
                 <w:b/>
                 <w:sz w:val="18"/>
               </w:rPr>
-              <w:t>Size KB</w:t>
+              <w:t>KB</w:t>
             </w:r>
           </w:p>
         </w:tc>
         <w:tc>
           <w:tcPr>
             <w:tcW w:type="dxa" w:w="1337"/>
+            <w:shd w:val="clear" w:color="auto" w:fill="E8E5DC"/>
           </w:tcPr>
           <w:p>
             <w:r>
@@ -813,6 +369,7 @@
         <w:tc>
           <w:tcPr>
             <w:tcW w:type="dxa" w:w="1337"/>
+            <w:shd w:val="clear" w:color="auto" w:fill="E8E5DC"/>
           </w:tcPr>
           <w:p>
             <w:r>
@@ -827,6 +384,7 @@
         <w:tc>
           <w:tcPr>
             <w:tcW w:type="dxa" w:w="1337"/>
+            <w:shd w:val="clear" w:color="auto" w:fill="E8E5DC"/>
           </w:tcPr>
           <w:p>
             <w:r>
@@ -841,6 +399,7 @@
         <w:tc>
           <w:tcPr>
             <w:tcW w:type="dxa" w:w="1337"/>
+            <w:shd w:val="clear" w:color="auto" w:fill="E8E5DC"/>
           </w:tcPr>
           <w:p>
             <w:r>
@@ -848,13 +407,14 @@
                 <w:b/>
                 <w:sz w:val="18"/>
               </w:rPr>
-              <w:t>Issues found</w:t>
+              <w:t>Pri</w:t>
             </w:r>
           </w:p>
         </w:tc>
         <w:tc>
           <w:tcPr>
             <w:tcW w:type="dxa" w:w="1337"/>
+            <w:shd w:val="clear" w:color="auto" w:fill="E8E5DC"/>
           </w:tcPr>
           <w:p>
             <w:r>
@@ -862,7 +422,7 @@
                 <w:b/>
                 <w:sz w:val="18"/>
               </w:rPr>
-              <w:t>Priority</w:t>
+              <w:t>Issues</w:t>
             </w:r>
           </w:p>
         </w:tc>
@@ -877,7 +437,7 @@
               <w:rPr>
                 <w:sz w:val="17"/>
               </w:rPr>
-              <w:t>Acronym_Database</w:t>
+              <w:t>Acronym_Database.html</w:t>
             </w:r>
           </w:p>
         </w:tc>
@@ -890,7 +450,7 @@
               <w:rPr>
                 <w:sz w:val="17"/>
               </w:rPr>
-              <w:t>93.7</w:t>
+              <w:t>93</w:t>
             </w:r>
           </w:p>
         </w:tc>
@@ -916,7 +476,7 @@
               <w:rPr>
                 <w:sz w:val="17"/>
               </w:rPr>
-              <w:t>Y</w:t>
+              <w:t>1</w:t>
             </w:r>
           </w:p>
         </w:tc>
@@ -929,7 +489,21 @@
               <w:rPr>
                 <w:sz w:val="17"/>
               </w:rPr>
-              <w:t>Y</w:t>
+              <w:t>1</w:t>
+            </w:r>
+          </w:p>
+        </w:tc>
+        <w:tc>
+          <w:tcPr>
+            <w:tcW w:type="dxa" w:w="1337"/>
+            <w:shd w:val="clear" w:color="auto" w:fill="F5E1B8"/>
+          </w:tcPr>
+          <w:p>
+            <w:r>
+              <w:rPr>
+                <w:sz w:val="17"/>
+              </w:rPr>
+              <w:t>MED</w:t>
             </w:r>
           </w:p>
         </w:tc>
@@ -942,20 +516,7 @@
               <w:rPr>
                 <w:sz w:val="17"/>
               </w:rPr>
-              <w:t>No PMIDs (reference dashboard, by design)</w:t>
-            </w:r>
-          </w:p>
-        </w:tc>
-        <w:tc>
-          <w:tcPr>
-            <w:tcW w:type="dxa" w:w="1337"/>
-          </w:tcPr>
-          <w:p>
-            <w:r>
-              <w:rPr>
-                <w:sz w:val="17"/>
-              </w:rPr>
-              <w:t>—</w:t>
+              <w:t>0 PMIDs (intentional — reference dashboard)</w:t>
             </w:r>
           </w:p>
         </w:tc>
@@ -970,7 +531,7 @@
               <w:rPr>
                 <w:sz w:val="17"/>
               </w:rPr>
-              <w:t>CART_Access_Barriers</w:t>
+              <w:t>CART_Access_Barriers.html</w:t>
             </w:r>
           </w:p>
         </w:tc>
@@ -983,7 +544,7 @@
               <w:rPr>
                 <w:sz w:val="17"/>
               </w:rPr>
-              <w:t>85.1</w:t>
+              <w:t>85</w:t>
             </w:r>
           </w:p>
         </w:tc>
@@ -1009,7 +570,7 @@
               <w:rPr>
                 <w:sz w:val="17"/>
               </w:rPr>
-              <w:t>Y</w:t>
+              <w:t>1</w:t>
             </w:r>
           </w:p>
         </w:tc>
@@ -1022,7 +583,20 @@
               <w:rPr>
                 <w:sz w:val="17"/>
               </w:rPr>
-              <w:t>Y</w:t>
+              <w:t>1</w:t>
+            </w:r>
+          </w:p>
+        </w:tc>
+        <w:tc>
+          <w:tcPr>
+            <w:tcW w:type="dxa" w:w="1337"/>
+          </w:tcPr>
+          <w:p>
+            <w:r>
+              <w:rPr>
+                <w:sz w:val="17"/>
+              </w:rPr>
+              <w:t>—</w:t>
             </w:r>
           </w:p>
         </w:tc>
@@ -1038,19 +612,6 @@
             </w:r>
           </w:p>
         </w:tc>
-        <w:tc>
-          <w:tcPr>
-            <w:tcW w:type="dxa" w:w="1337"/>
-          </w:tcPr>
-          <w:p>
-            <w:r>
-              <w:rPr>
-                <w:sz w:val="17"/>
-              </w:rPr>
-              <w:t>OK</w:t>
-            </w:r>
-          </w:p>
-        </w:tc>
       </w:tr>
       <w:tr>
         <w:tc>
@@ -1062,7 +623,7 @@
               <w:rPr>
                 <w:sz w:val="17"/>
               </w:rPr>
-              <w:t>Clinical_Trial_Dashboard</w:t>
+              <w:t>Clinical_Trial_Dashboard.html</w:t>
             </w:r>
           </w:p>
         </w:tc>
@@ -1075,7 +636,7 @@
               <w:rPr>
                 <w:sz w:val="17"/>
               </w:rPr>
-              <w:t>441.8</w:t>
+              <w:t>445</w:t>
             </w:r>
           </w:p>
         </w:tc>
@@ -1101,7 +662,7 @@
               <w:rPr>
                 <w:sz w:val="17"/>
               </w:rPr>
-              <w:t>Y</w:t>
+              <w:t>1</w:t>
             </w:r>
           </w:p>
         </w:tc>
@@ -1114,7 +675,21 @@
               <w:rPr>
                 <w:sz w:val="17"/>
               </w:rPr>
-              <w:t>Y</w:t>
+              <w:t>1</w:t>
+            </w:r>
+          </w:p>
+        </w:tc>
+        <w:tc>
+          <w:tcPr>
+            <w:tcW w:type="dxa" w:w="1337"/>
+            <w:shd w:val="clear" w:color="auto" w:fill="F5E1B8"/>
+          </w:tcPr>
+          <w:p>
+            <w:r>
+              <w:rPr>
+                <w:sz w:val="17"/>
+              </w:rPr>
+              <w:t>MED</w:t>
             </w:r>
           </w:p>
         </w:tc>
@@ -1127,20 +702,7 @@
               <w:rPr>
                 <w:sz w:val="17"/>
               </w:rPr>
-              <w:t>Prose still reads "748+" while landing page reads 797</w:t>
-            </w:r>
-          </w:p>
-        </w:tc>
-        <w:tc>
-          <w:tcPr>
-            <w:tcW w:type="dxa" w:w="1337"/>
-          </w:tcPr>
-          <w:p>
-            <w:r>
-              <w:rPr>
-                <w:sz w:val="17"/>
-              </w:rPr>
-              <w:t>MED</w:t>
+              <w:t>Stale prose: '748+ diabetes clinical trials'</w:t>
             </w:r>
           </w:p>
         </w:tc>
@@ -1155,7 +717,7 @@
               <w:rPr>
                 <w:sz w:val="17"/>
               </w:rPr>
-              <w:t>Corpus_Analysis</w:t>
+              <w:t>Corpus_Analysis.html</w:t>
             </w:r>
           </w:p>
         </w:tc>
@@ -1168,7 +730,7 @@
               <w:rPr>
                 <w:sz w:val="17"/>
               </w:rPr>
-              <w:t>82.4</w:t>
+              <w:t>82</w:t>
             </w:r>
           </w:p>
         </w:tc>
@@ -1194,7 +756,7 @@
               <w:rPr>
                 <w:sz w:val="17"/>
               </w:rPr>
-              <w:t>Y</w:t>
+              <w:t>1</w:t>
             </w:r>
           </w:p>
         </w:tc>
@@ -1207,7 +769,20 @@
               <w:rPr>
                 <w:sz w:val="17"/>
               </w:rPr>
-              <w:t>Y</w:t>
+              <w:t>1</w:t>
+            </w:r>
+          </w:p>
+        </w:tc>
+        <w:tc>
+          <w:tcPr>
+            <w:tcW w:type="dxa" w:w="1337"/>
+          </w:tcPr>
+          <w:p>
+            <w:r>
+              <w:rPr>
+                <w:sz w:val="17"/>
+              </w:rPr>
+              <w:t>—</w:t>
             </w:r>
           </w:p>
         </w:tc>
@@ -1223,19 +798,6 @@
             </w:r>
           </w:p>
         </w:tc>
-        <w:tc>
-          <w:tcPr>
-            <w:tcW w:type="dxa" w:w="1337"/>
-          </w:tcPr>
-          <w:p>
-            <w:r>
-              <w:rPr>
-                <w:sz w:val="17"/>
-              </w:rPr>
-              <w:t>OK</w:t>
-            </w:r>
-          </w:p>
-        </w:tc>
       </w:tr>
       <w:tr>
         <w:tc>
@@ -1247,7 +809,7 @@
               <w:rPr>
                 <w:sz w:val="17"/>
               </w:rPr>
-              <w:t>Drug_Repurposing_Islet</w:t>
+              <w:t>Drug_Repurposing_Islet.html</w:t>
             </w:r>
           </w:p>
         </w:tc>
@@ -1260,7 +822,7 @@
               <w:rPr>
                 <w:sz w:val="17"/>
               </w:rPr>
-              <w:t>59.9</w:t>
+              <w:t>59</w:t>
             </w:r>
           </w:p>
         </w:tc>
@@ -1286,7 +848,7 @@
               <w:rPr>
                 <w:sz w:val="17"/>
               </w:rPr>
-              <w:t>Y</w:t>
+              <w:t>1</w:t>
             </w:r>
           </w:p>
         </w:tc>
@@ -1299,7 +861,21 @@
               <w:rPr>
                 <w:sz w:val="17"/>
               </w:rPr>
-              <w:t>Y</w:t>
+              <w:t>1</w:t>
+            </w:r>
+          </w:p>
+        </w:tc>
+        <w:tc>
+          <w:tcPr>
+            <w:tcW w:type="dxa" w:w="1337"/>
+            <w:shd w:val="clear" w:color="auto" w:fill="F5E1B8"/>
+          </w:tcPr>
+          <w:p>
+            <w:r>
+              <w:rPr>
+                <w:sz w:val="17"/>
+              </w:rPr>
+              <w:t>MED</w:t>
             </w:r>
           </w:p>
         </w:tc>
@@ -1312,20 +888,7 @@
               <w:rPr>
                 <w:sz w:val="17"/>
               </w:rPr>
-              <w:t>7 hrefs with sentence-as-PMID (carryover)</w:t>
-            </w:r>
-          </w:p>
-        </w:tc>
-        <w:tc>
-          <w:tcPr>
-            <w:tcW w:type="dxa" w:w="1337"/>
-          </w:tcPr>
-          <w:p>
-            <w:r>
-              <w:rPr>
-                <w:sz w:val="17"/>
-              </w:rPr>
-              <w:t>MED</w:t>
+              <w:t>7 sentence-as-PMID hrefs (carryover, 4th cycle)</w:t>
             </w:r>
           </w:p>
         </w:tc>
@@ -1340,7 +903,7 @@
               <w:rPr>
                 <w:sz w:val="17"/>
               </w:rPr>
-              <w:t>Drug_Repurposing_Screen</w:t>
+              <w:t>Drug_Repurposing_Screen.html</w:t>
             </w:r>
           </w:p>
         </w:tc>
@@ -1353,7 +916,7 @@
               <w:rPr>
                 <w:sz w:val="17"/>
               </w:rPr>
-              <w:t>119.3</w:t>
+              <w:t>119</w:t>
             </w:r>
           </w:p>
         </w:tc>
@@ -1379,7 +942,7 @@
               <w:rPr>
                 <w:sz w:val="17"/>
               </w:rPr>
-              <w:t>Y</w:t>
+              <w:t>1</w:t>
             </w:r>
           </w:p>
         </w:tc>
@@ -1392,7 +955,20 @@
               <w:rPr>
                 <w:sz w:val="17"/>
               </w:rPr>
-              <w:t>Y</w:t>
+              <w:t>1</w:t>
+            </w:r>
+          </w:p>
+        </w:tc>
+        <w:tc>
+          <w:tcPr>
+            <w:tcW w:type="dxa" w:w="1337"/>
+          </w:tcPr>
+          <w:p>
+            <w:r>
+              <w:rPr>
+                <w:sz w:val="17"/>
+              </w:rPr>
+              <w:t>—</w:t>
             </w:r>
           </w:p>
         </w:tc>
@@ -1408,19 +984,6 @@
             </w:r>
           </w:p>
         </w:tc>
-        <w:tc>
-          <w:tcPr>
-            <w:tcW w:type="dxa" w:w="1337"/>
-          </w:tcPr>
-          <w:p>
-            <w:r>
-              <w:rPr>
-                <w:sz w:val="17"/>
-              </w:rPr>
-              <w:t>OK</w:t>
-            </w:r>
-          </w:p>
-        </w:tc>
       </w:tr>
       <w:tr>
         <w:tc>
@@ -1432,7 +995,7 @@
               <w:rPr>
                 <w:sz w:val="17"/>
               </w:rPr>
-              <w:t>Equity_Map</w:t>
+              <w:t>Equity_Map.html</w:t>
             </w:r>
           </w:p>
         </w:tc>
@@ -1445,7 +1008,7 @@
               <w:rPr>
                 <w:sz w:val="17"/>
               </w:rPr>
-              <w:t>81.1</w:t>
+              <w:t>81</w:t>
             </w:r>
           </w:p>
         </w:tc>
@@ -1471,7 +1034,7 @@
               <w:rPr>
                 <w:sz w:val="17"/>
               </w:rPr>
-              <w:t>Y</w:t>
+              <w:t>1</w:t>
             </w:r>
           </w:p>
         </w:tc>
@@ -1484,7 +1047,20 @@
               <w:rPr>
                 <w:sz w:val="17"/>
               </w:rPr>
-              <w:t>Y</w:t>
+              <w:t>1</w:t>
+            </w:r>
+          </w:p>
+        </w:tc>
+        <w:tc>
+          <w:tcPr>
+            <w:tcW w:type="dxa" w:w="1337"/>
+          </w:tcPr>
+          <w:p>
+            <w:r>
+              <w:rPr>
+                <w:sz w:val="17"/>
+              </w:rPr>
+              <w:t>—</w:t>
             </w:r>
           </w:p>
         </w:tc>
@@ -1500,19 +1076,6 @@
             </w:r>
           </w:p>
         </w:tc>
-        <w:tc>
-          <w:tcPr>
-            <w:tcW w:type="dxa" w:w="1337"/>
-          </w:tcPr>
-          <w:p>
-            <w:r>
-              <w:rPr>
-                <w:sz w:val="17"/>
-              </w:rPr>
-              <w:t>OK</w:t>
-            </w:r>
-          </w:p>
-        </w:tc>
       </w:tr>
       <w:tr>
         <w:tc>
@@ -1524,7 +1087,7 @@
               <w:rPr>
                 <w:sz w:val="17"/>
               </w:rPr>
-              <w:t>Extracted_Evidence</w:t>
+              <w:t>Extracted_Evidence.html</w:t>
             </w:r>
           </w:p>
         </w:tc>
@@ -1537,7 +1100,7 @@
               <w:rPr>
                 <w:sz w:val="17"/>
               </w:rPr>
-              <w:t>133.7</w:t>
+              <w:t>133</w:t>
             </w:r>
           </w:p>
         </w:tc>
@@ -1563,7 +1126,7 @@
               <w:rPr>
                 <w:sz w:val="17"/>
               </w:rPr>
-              <w:t>Y</w:t>
+              <w:t>1</w:t>
             </w:r>
           </w:p>
         </w:tc>
@@ -1576,7 +1139,21 @@
               <w:rPr>
                 <w:sz w:val="17"/>
               </w:rPr>
-              <w:t>Y</w:t>
+              <w:t>1</w:t>
+            </w:r>
+          </w:p>
+        </w:tc>
+        <w:tc>
+          <w:tcPr>
+            <w:tcW w:type="dxa" w:w="1337"/>
+            <w:shd w:val="clear" w:color="auto" w:fill="F5F0D8"/>
+          </w:tcPr>
+          <w:p>
+            <w:r>
+              <w:rPr>
+                <w:sz w:val="17"/>
+              </w:rPr>
+              <w:t>LOW</w:t>
             </w:r>
           </w:p>
         </w:tc>
@@ -1589,20 +1166,7 @@
               <w:rPr>
                 <w:sz w:val="17"/>
               </w:rPr>
-              <w:t>12/15 tables lack &lt;thead&gt;</w:t>
-            </w:r>
-          </w:p>
-        </w:tc>
-        <w:tc>
-          <w:tcPr>
-            <w:tcW w:type="dxa" w:w="1337"/>
-          </w:tcPr>
-          <w:p>
-            <w:r>
-              <w:rPr>
-                <w:sz w:val="17"/>
-              </w:rPr>
-              <w:t>LOW</w:t>
+              <w:t>12 of 15 tables emitted without &lt;thead&gt;</w:t>
             </w:r>
           </w:p>
         </w:tc>
@@ -1617,7 +1181,7 @@
               <w:rPr>
                 <w:sz w:val="17"/>
               </w:rPr>
-              <w:t>GKA_LADA</w:t>
+              <w:t>GKA_LADA.html</w:t>
             </w:r>
           </w:p>
         </w:tc>
@@ -1630,7 +1194,7 @@
               <w:rPr>
                 <w:sz w:val="17"/>
               </w:rPr>
-              <w:t>42.8</w:t>
+              <w:t>42</w:t>
             </w:r>
           </w:p>
         </w:tc>
@@ -1656,7 +1220,7 @@
               <w:rPr>
                 <w:sz w:val="17"/>
               </w:rPr>
-              <w:t>Y</w:t>
+              <w:t>1</w:t>
             </w:r>
           </w:p>
         </w:tc>
@@ -1669,7 +1233,20 @@
               <w:rPr>
                 <w:sz w:val="17"/>
               </w:rPr>
-              <w:t>Y</w:t>
+              <w:t>1</w:t>
+            </w:r>
+          </w:p>
+        </w:tc>
+        <w:tc>
+          <w:tcPr>
+            <w:tcW w:type="dxa" w:w="1337"/>
+          </w:tcPr>
+          <w:p>
+            <w:r>
+              <w:rPr>
+                <w:sz w:val="17"/>
+              </w:rPr>
+              <w:t>—</w:t>
             </w:r>
           </w:p>
         </w:tc>
@@ -1685,19 +1262,6 @@
             </w:r>
           </w:p>
         </w:tc>
-        <w:tc>
-          <w:tcPr>
-            <w:tcW w:type="dxa" w:w="1337"/>
-          </w:tcPr>
-          <w:p>
-            <w:r>
-              <w:rPr>
-                <w:sz w:val="17"/>
-              </w:rPr>
-              <w:t>OK</w:t>
-            </w:r>
-          </w:p>
-        </w:tc>
       </w:tr>
       <w:tr>
         <w:tc>
@@ -1709,7 +1273,7 @@
               <w:rPr>
                 <w:sz w:val="17"/>
               </w:rPr>
-              <w:t>GKA_Landscape</w:t>
+              <w:t>GKA_Landscape.html</w:t>
             </w:r>
           </w:p>
         </w:tc>
@@ -1722,7 +1286,7 @@
               <w:rPr>
                 <w:sz w:val="17"/>
               </w:rPr>
-              <w:t>60.0</w:t>
+              <w:t>60</w:t>
             </w:r>
           </w:p>
         </w:tc>
@@ -1748,7 +1312,7 @@
               <w:rPr>
                 <w:sz w:val="17"/>
               </w:rPr>
-              <w:t>Y</w:t>
+              <w:t>1</w:t>
             </w:r>
           </w:p>
         </w:tc>
@@ -1761,7 +1325,21 @@
               <w:rPr>
                 <w:sz w:val="17"/>
               </w:rPr>
-              <w:t>Y</w:t>
+              <w:t>1</w:t>
+            </w:r>
+          </w:p>
+        </w:tc>
+        <w:tc>
+          <w:tcPr>
+            <w:tcW w:type="dxa" w:w="1337"/>
+            <w:shd w:val="clear" w:color="auto" w:fill="F5F0D8"/>
+          </w:tcPr>
+          <w:p>
+            <w:r>
+              <w:rPr>
+                <w:sz w:val="17"/>
+              </w:rPr>
+              <w:t>LOW</w:t>
             </w:r>
           </w:p>
         </w:tc>
@@ -1774,20 +1352,7 @@
               <w:rPr>
                 <w:sz w:val="17"/>
               </w:rPr>
-              <w:t>Footer reads "Generated 2025" (hardcoded)</w:t>
-            </w:r>
-          </w:p>
-        </w:tc>
-        <w:tc>
-          <w:tcPr>
-            <w:tcW w:type="dxa" w:w="1337"/>
-          </w:tcPr>
-          <w:p>
-            <w:r>
-              <w:rPr>
-                <w:sz w:val="17"/>
-              </w:rPr>
-              <w:t>LOW</w:t>
+              <w:t>Footer 'Generated 2025' hardcoded (carryover)</w:t>
             </w:r>
           </w:p>
         </w:tc>
@@ -1802,7 +1367,7 @@
               <w:rPr>
                 <w:sz w:val="17"/>
               </w:rPr>
-              <w:t>GKA_Pricing</w:t>
+              <w:t>GKA_Pricing.html</w:t>
             </w:r>
           </w:p>
         </w:tc>
@@ -1815,7 +1380,7 @@
               <w:rPr>
                 <w:sz w:val="17"/>
               </w:rPr>
-              <w:t>52.9</w:t>
+              <w:t>52</w:t>
             </w:r>
           </w:p>
         </w:tc>
@@ -1841,7 +1406,7 @@
               <w:rPr>
                 <w:sz w:val="17"/>
               </w:rPr>
-              <w:t>Y</w:t>
+              <w:t>1</w:t>
             </w:r>
           </w:p>
         </w:tc>
@@ -1854,7 +1419,21 @@
               <w:rPr>
                 <w:sz w:val="17"/>
               </w:rPr>
-              <w:t>Y</w:t>
+              <w:t>1</w:t>
+            </w:r>
+          </w:p>
+        </w:tc>
+        <w:tc>
+          <w:tcPr>
+            <w:tcW w:type="dxa" w:w="1337"/>
+            <w:shd w:val="clear" w:color="auto" w:fill="F5F0D8"/>
+          </w:tcPr>
+          <w:p>
+            <w:r>
+              <w:rPr>
+                <w:sz w:val="17"/>
+              </w:rPr>
+              <w:t>LOW</w:t>
             </w:r>
           </w:p>
         </w:tc>
@@ -1867,20 +1446,7 @@
               <w:rPr>
                 <w:sz w:val="17"/>
               </w:rPr>
-              <w:t>4/4 tables lack &lt;thead&gt;</w:t>
-            </w:r>
-          </w:p>
-        </w:tc>
-        <w:tc>
-          <w:tcPr>
-            <w:tcW w:type="dxa" w:w="1337"/>
-          </w:tcPr>
-          <w:p>
-            <w:r>
-              <w:rPr>
-                <w:sz w:val="17"/>
-              </w:rPr>
-              <w:t>LOW</w:t>
+              <w:t>4 of 4 tables emitted without &lt;thead&gt;</w:t>
             </w:r>
           </w:p>
         </w:tc>
@@ -1895,7 +1461,7 @@
               <w:rPr>
                 <w:sz w:val="17"/>
               </w:rPr>
-              <w:t>Gap_Deep_Dives</w:t>
+              <w:t>Gap_Deep_Dives.html</w:t>
             </w:r>
           </w:p>
         </w:tc>
@@ -1908,7 +1474,7 @@
               <w:rPr>
                 <w:sz w:val="17"/>
               </w:rPr>
-              <w:t>218.3</w:t>
+              <w:t>218</w:t>
             </w:r>
           </w:p>
         </w:tc>
@@ -1934,7 +1500,7 @@
               <w:rPr>
                 <w:sz w:val="17"/>
               </w:rPr>
-              <w:t>Y</w:t>
+              <w:t>1</w:t>
             </w:r>
           </w:p>
         </w:tc>
@@ -1947,7 +1513,21 @@
               <w:rPr>
                 <w:sz w:val="17"/>
               </w:rPr>
-              <w:t>Y</w:t>
+              <w:t>1</w:t>
+            </w:r>
+          </w:p>
+        </w:tc>
+        <w:tc>
+          <w:tcPr>
+            <w:tcW w:type="dxa" w:w="1337"/>
+            <w:shd w:val="clear" w:color="auto" w:fill="F5E1B8"/>
+          </w:tcPr>
+          <w:p>
+            <w:r>
+              <w:rPr>
+                <w:sz w:val="17"/>
+              </w:rPr>
+              <w:t>MED</w:t>
             </w:r>
           </w:p>
         </w:tc>
@@ -1960,20 +1540,7 @@
               <w:rPr>
                 <w:sz w:val="17"/>
               </w:rPr>
-              <w:t>Two "746" prose references vs. live 797</w:t>
-            </w:r>
-          </w:p>
-        </w:tc>
-        <w:tc>
-          <w:tcPr>
-            <w:tcW w:type="dxa" w:w="1337"/>
-          </w:tcPr>
-          <w:p>
-            <w:r>
-              <w:rPr>
-                <w:sz w:val="17"/>
-              </w:rPr>
-              <w:t>MED</w:t>
+              <w:t>'746-trial database' prose, two occurrences</w:t>
             </w:r>
           </w:p>
         </w:tc>
@@ -1988,7 +1555,7 @@
               <w:rPr>
                 <w:sz w:val="17"/>
               </w:rPr>
-              <w:t>Gap_Evidence</w:t>
+              <w:t>Gap_Evidence.html</w:t>
             </w:r>
           </w:p>
         </w:tc>
@@ -2001,7 +1568,7 @@
               <w:rPr>
                 <w:sz w:val="17"/>
               </w:rPr>
-              <w:t>182.1</w:t>
+              <w:t>182</w:t>
             </w:r>
           </w:p>
         </w:tc>
@@ -2027,7 +1594,7 @@
               <w:rPr>
                 <w:sz w:val="17"/>
               </w:rPr>
-              <w:t>Y</w:t>
+              <w:t>1</w:t>
             </w:r>
           </w:p>
         </w:tc>
@@ -2040,7 +1607,20 @@
               <w:rPr>
                 <w:sz w:val="17"/>
               </w:rPr>
-              <w:t>Y</w:t>
+              <w:t>1</w:t>
+            </w:r>
+          </w:p>
+        </w:tc>
+        <w:tc>
+          <w:tcPr>
+            <w:tcW w:type="dxa" w:w="1337"/>
+          </w:tcPr>
+          <w:p>
+            <w:r>
+              <w:rPr>
+                <w:sz w:val="17"/>
+              </w:rPr>
+              <w:t>—</w:t>
             </w:r>
           </w:p>
         </w:tc>
@@ -2056,19 +1636,6 @@
             </w:r>
           </w:p>
         </w:tc>
-        <w:tc>
-          <w:tcPr>
-            <w:tcW w:type="dxa" w:w="1337"/>
-          </w:tcPr>
-          <w:p>
-            <w:r>
-              <w:rPr>
-                <w:sz w:val="17"/>
-              </w:rPr>
-              <w:t>OK</w:t>
-            </w:r>
-          </w:p>
-        </w:tc>
       </w:tr>
       <w:tr>
         <w:tc>
@@ -2080,7 +1647,7 @@
               <w:rPr>
                 <w:sz w:val="17"/>
               </w:rPr>
-              <w:t>Gap_Synthesis</w:t>
+              <w:t>Gap_Synthesis.html</w:t>
             </w:r>
           </w:p>
         </w:tc>
@@ -2093,7 +1660,7 @@
               <w:rPr>
                 <w:sz w:val="17"/>
               </w:rPr>
-              <w:t>121.8</w:t>
+              <w:t>121</w:t>
             </w:r>
           </w:p>
         </w:tc>
@@ -2119,7 +1686,7 @@
               <w:rPr>
                 <w:sz w:val="17"/>
               </w:rPr>
-              <w:t>Y</w:t>
+              <w:t>1</w:t>
             </w:r>
           </w:p>
         </w:tc>
@@ -2132,7 +1699,20 @@
               <w:rPr>
                 <w:sz w:val="17"/>
               </w:rPr>
-              <w:t>Y</w:t>
+              <w:t>1</w:t>
+            </w:r>
+          </w:p>
+        </w:tc>
+        <w:tc>
+          <w:tcPr>
+            <w:tcW w:type="dxa" w:w="1337"/>
+          </w:tcPr>
+          <w:p>
+            <w:r>
+              <w:rPr>
+                <w:sz w:val="17"/>
+              </w:rPr>
+              <w:t>—</w:t>
             </w:r>
           </w:p>
         </w:tc>
@@ -2148,19 +1728,6 @@
             </w:r>
           </w:p>
         </w:tc>
-        <w:tc>
-          <w:tcPr>
-            <w:tcW w:type="dxa" w:w="1337"/>
-          </w:tcPr>
-          <w:p>
-            <w:r>
-              <w:rPr>
-                <w:sz w:val="17"/>
-              </w:rPr>
-              <w:t>OK</w:t>
-            </w:r>
-          </w:p>
-        </w:tc>
       </w:tr>
       <w:tr>
         <w:tc>
@@ -2172,7 +1739,7 @@
               <w:rPr>
                 <w:sz w:val="17"/>
               </w:rPr>
-              <w:t>Generic_Drug_Catalog</w:t>
+              <w:t>Generic_Drug_Catalog.html</w:t>
             </w:r>
           </w:p>
         </w:tc>
@@ -2185,7 +1752,7 @@
               <w:rPr>
                 <w:sz w:val="17"/>
               </w:rPr>
-              <w:t>48.3</w:t>
+              <w:t>48</w:t>
             </w:r>
           </w:p>
         </w:tc>
@@ -2211,7 +1778,7 @@
               <w:rPr>
                 <w:sz w:val="17"/>
               </w:rPr>
-              <w:t>Y</w:t>
+              <w:t>1</w:t>
             </w:r>
           </w:p>
         </w:tc>
@@ -2224,7 +1791,21 @@
               <w:rPr>
                 <w:sz w:val="17"/>
               </w:rPr>
-              <w:t>Y</w:t>
+              <w:t>1</w:t>
+            </w:r>
+          </w:p>
+        </w:tc>
+        <w:tc>
+          <w:tcPr>
+            <w:tcW w:type="dxa" w:w="1337"/>
+            <w:shd w:val="clear" w:color="auto" w:fill="F5E1B8"/>
+          </w:tcPr>
+          <w:p>
+            <w:r>
+              <w:rPr>
+                <w:sz w:val="17"/>
+              </w:rPr>
+              <w:t>MED</w:t>
             </w:r>
           </w:p>
         </w:tc>
@@ -2237,20 +1818,7 @@
               <w:rPr>
                 <w:sz w:val="17"/>
               </w:rPr>
-              <w:t>JS template-literal leak in 2 href values (runtime-OK)</w:t>
-            </w:r>
-          </w:p>
-        </w:tc>
-        <w:tc>
-          <w:tcPr>
-            <w:tcW w:type="dxa" w:w="1337"/>
-          </w:tcPr>
-          <w:p>
-            <w:r>
-              <w:rPr>
-                <w:sz w:val="17"/>
-              </w:rPr>
-              <w:t>LOW</w:t>
+              <w:t>JS template literal leak (carryover)</w:t>
             </w:r>
           </w:p>
         </w:tc>
@@ -2265,7 +1833,7 @@
               <w:rPr>
                 <w:sz w:val="17"/>
               </w:rPr>
-              <w:t>Health_Equity</w:t>
+              <w:t>Health_Equity.html</w:t>
             </w:r>
           </w:p>
         </w:tc>
@@ -2278,7 +1846,7 @@
               <w:rPr>
                 <w:sz w:val="17"/>
               </w:rPr>
-              <w:t>76.1</w:t>
+              <w:t>76</w:t>
             </w:r>
           </w:p>
         </w:tc>
@@ -2304,7 +1872,7 @@
               <w:rPr>
                 <w:sz w:val="17"/>
               </w:rPr>
-              <w:t>Y</w:t>
+              <w:t>1</w:t>
             </w:r>
           </w:p>
         </w:tc>
@@ -2317,7 +1885,20 @@
               <w:rPr>
                 <w:sz w:val="17"/>
               </w:rPr>
-              <w:t>Y</w:t>
+              <w:t>1</w:t>
+            </w:r>
+          </w:p>
+        </w:tc>
+        <w:tc>
+          <w:tcPr>
+            <w:tcW w:type="dxa" w:w="1337"/>
+          </w:tcPr>
+          <w:p>
+            <w:r>
+              <w:rPr>
+                <w:sz w:val="17"/>
+              </w:rPr>
+              <w:t>—</w:t>
             </w:r>
           </w:p>
         </w:tc>
@@ -2333,19 +1914,6 @@
             </w:r>
           </w:p>
         </w:tc>
-        <w:tc>
-          <w:tcPr>
-            <w:tcW w:type="dxa" w:w="1337"/>
-          </w:tcPr>
-          <w:p>
-            <w:r>
-              <w:rPr>
-                <w:sz w:val="17"/>
-              </w:rPr>
-              <w:t>OK</w:t>
-            </w:r>
-          </w:p>
-        </w:tc>
       </w:tr>
       <w:tr>
         <w:tc>
@@ -2357,7 +1925,7 @@
               <w:rPr>
                 <w:sz w:val="17"/>
               </w:rPr>
-              <w:t>Immunomod_LADA</w:t>
+              <w:t>Immunomod_LADA.html</w:t>
             </w:r>
           </w:p>
         </w:tc>
@@ -2370,7 +1938,7 @@
               <w:rPr>
                 <w:sz w:val="17"/>
               </w:rPr>
-              <w:t>50.9</w:t>
+              <w:t>50</w:t>
             </w:r>
           </w:p>
         </w:tc>
@@ -2396,7 +1964,7 @@
               <w:rPr>
                 <w:sz w:val="17"/>
               </w:rPr>
-              <w:t>Y</w:t>
+              <w:t>1</w:t>
             </w:r>
           </w:p>
         </w:tc>
@@ -2409,7 +1977,20 @@
               <w:rPr>
                 <w:sz w:val="17"/>
               </w:rPr>
-              <w:t>Y</w:t>
+              <w:t>1</w:t>
+            </w:r>
+          </w:p>
+        </w:tc>
+        <w:tc>
+          <w:tcPr>
+            <w:tcW w:type="dxa" w:w="1337"/>
+          </w:tcPr>
+          <w:p>
+            <w:r>
+              <w:rPr>
+                <w:sz w:val="17"/>
+              </w:rPr>
+              <w:t>—</w:t>
             </w:r>
           </w:p>
         </w:tc>
@@ -2425,19 +2006,6 @@
             </w:r>
           </w:p>
         </w:tc>
-        <w:tc>
-          <w:tcPr>
-            <w:tcW w:type="dxa" w:w="1337"/>
-          </w:tcPr>
-          <w:p>
-            <w:r>
-              <w:rPr>
-                <w:sz w:val="17"/>
-              </w:rPr>
-              <w:t>OK</w:t>
-            </w:r>
-          </w:p>
-        </w:tc>
       </w:tr>
       <w:tr>
         <w:tc>
@@ -2449,7 +2017,7 @@
               <w:rPr>
                 <w:sz w:val="17"/>
               </w:rPr>
-              <w:t>Islet_Drug_Repurposing</w:t>
+              <w:t>Islet_Drug_Repurposing.html</w:t>
             </w:r>
           </w:p>
         </w:tc>
@@ -2462,7 +2030,7 @@
               <w:rPr>
                 <w:sz w:val="17"/>
               </w:rPr>
-              <w:t>115.6</w:t>
+              <w:t>115</w:t>
             </w:r>
           </w:p>
         </w:tc>
@@ -2488,7 +2056,7 @@
               <w:rPr>
                 <w:sz w:val="17"/>
               </w:rPr>
-              <w:t>Y</w:t>
+              <w:t>1</w:t>
             </w:r>
           </w:p>
         </w:tc>
@@ -2501,7 +2069,21 @@
               <w:rPr>
                 <w:sz w:val="17"/>
               </w:rPr>
-              <w:t>Y</w:t>
+              <w:t>1</w:t>
+            </w:r>
+          </w:p>
+        </w:tc>
+        <w:tc>
+          <w:tcPr>
+            <w:tcW w:type="dxa" w:w="1337"/>
+            <w:shd w:val="clear" w:color="auto" w:fill="F5C5C5"/>
+          </w:tcPr>
+          <w:p>
+            <w:r>
+              <w:rPr>
+                <w:sz w:val="17"/>
+              </w:rPr>
+              <w:t>HIGH</w:t>
             </w:r>
           </w:p>
         </w:tc>
@@ -2514,20 +2096,7 @@
               <w:rPr>
                 <w:sz w:val="17"/>
               </w:rPr>
-              <w:t>MISSING from docs/Dashboards/ mirror (404)</w:t>
-            </w:r>
-          </w:p>
-        </w:tc>
-        <w:tc>
-          <w:tcPr>
-            <w:tcW w:type="dxa" w:w="1337"/>
-          </w:tcPr>
-          <w:p>
-            <w:r>
-              <w:rPr>
-                <w:sz w:val="17"/>
-              </w:rPr>
-              <w:t>HIGH</w:t>
+              <w:t>Missing from docs/Dashboards/ mirror (4th cycle)</w:t>
             </w:r>
           </w:p>
         </w:tc>
@@ -2542,7 +2111,7 @@
               <w:rPr>
                 <w:sz w:val="17"/>
               </w:rPr>
-              <w:t>Islet_Transplant_Analysis</w:t>
+              <w:t>Islet_Transplant_Analysis.html</w:t>
             </w:r>
           </w:p>
         </w:tc>
@@ -2555,7 +2124,7 @@
               <w:rPr>
                 <w:sz w:val="17"/>
               </w:rPr>
-              <w:t>74.0</w:t>
+              <w:t>74</w:t>
             </w:r>
           </w:p>
         </w:tc>
@@ -2568,7 +2137,7 @@
               <w:rPr>
                 <w:sz w:val="17"/>
               </w:rPr>
-              <w:t>3</w:t>
+              <w:t>4</w:t>
             </w:r>
           </w:p>
         </w:tc>
@@ -2581,7 +2150,7 @@
               <w:rPr>
                 <w:sz w:val="17"/>
               </w:rPr>
-              <w:t>Y</w:t>
+              <w:t>1</w:t>
             </w:r>
           </w:p>
         </w:tc>
@@ -2594,7 +2163,20 @@
               <w:rPr>
                 <w:sz w:val="17"/>
               </w:rPr>
-              <w:t>Y</w:t>
+              <w:t>1</w:t>
+            </w:r>
+          </w:p>
+        </w:tc>
+        <w:tc>
+          <w:tcPr>
+            <w:tcW w:type="dxa" w:w="1337"/>
+          </w:tcPr>
+          <w:p>
+            <w:r>
+              <w:rPr>
+                <w:sz w:val="17"/>
+              </w:rPr>
+              <w:t>—</w:t>
             </w:r>
           </w:p>
         </w:tc>
@@ -2610,19 +2192,6 @@
             </w:r>
           </w:p>
         </w:tc>
-        <w:tc>
-          <w:tcPr>
-            <w:tcW w:type="dxa" w:w="1337"/>
-          </w:tcPr>
-          <w:p>
-            <w:r>
-              <w:rPr>
-                <w:sz w:val="17"/>
-              </w:rPr>
-              <w:t>OK</w:t>
-            </w:r>
-          </w:p>
-        </w:tc>
       </w:tr>
       <w:tr>
         <w:tc>
@@ -2634,7 +2203,7 @@
               <w:rPr>
                 <w:sz w:val="17"/>
               </w:rPr>
-              <w:t>Islet_Transplant_Equity</w:t>
+              <w:t>Islet_Transplant_Equity.html</w:t>
             </w:r>
           </w:p>
         </w:tc>
@@ -2647,7 +2216,7 @@
               <w:rPr>
                 <w:sz w:val="17"/>
               </w:rPr>
-              <w:t>43.5</w:t>
+              <w:t>43</w:t>
             </w:r>
           </w:p>
         </w:tc>
@@ -2673,7 +2242,7 @@
               <w:rPr>
                 <w:sz w:val="17"/>
               </w:rPr>
-              <w:t>Y</w:t>
+              <w:t>1</w:t>
             </w:r>
           </w:p>
         </w:tc>
@@ -2686,7 +2255,20 @@
               <w:rPr>
                 <w:sz w:val="17"/>
               </w:rPr>
-              <w:t>Y</w:t>
+              <w:t>1</w:t>
+            </w:r>
+          </w:p>
+        </w:tc>
+        <w:tc>
+          <w:tcPr>
+            <w:tcW w:type="dxa" w:w="1337"/>
+          </w:tcPr>
+          <w:p>
+            <w:r>
+              <w:rPr>
+                <w:sz w:val="17"/>
+              </w:rPr>
+              <w:t>—</w:t>
             </w:r>
           </w:p>
         </w:tc>
@@ -2702,19 +2284,6 @@
             </w:r>
           </w:p>
         </w:tc>
-        <w:tc>
-          <w:tcPr>
-            <w:tcW w:type="dxa" w:w="1337"/>
-          </w:tcPr>
-          <w:p>
-            <w:r>
-              <w:rPr>
-                <w:sz w:val="17"/>
-              </w:rPr>
-              <w:t>OK</w:t>
-            </w:r>
-          </w:p>
-        </w:tc>
       </w:tr>
       <w:tr>
         <w:tc>
@@ -2726,7 +2295,7 @@
               <w:rPr>
                 <w:sz w:val="17"/>
               </w:rPr>
-              <w:t>LADA_Diagnostic_Model</w:t>
+              <w:t>LADA_Diagnostic_Model.html</w:t>
             </w:r>
           </w:p>
         </w:tc>
@@ -2739,7 +2308,7 @@
               <w:rPr>
                 <w:sz w:val="17"/>
               </w:rPr>
-              <w:t>57.3</w:t>
+              <w:t>57</w:t>
             </w:r>
           </w:p>
         </w:tc>
@@ -2765,7 +2334,7 @@
               <w:rPr>
                 <w:sz w:val="17"/>
               </w:rPr>
-              <w:t>Y</w:t>
+              <w:t>1</w:t>
             </w:r>
           </w:p>
         </w:tc>
@@ -2778,7 +2347,20 @@
               <w:rPr>
                 <w:sz w:val="17"/>
               </w:rPr>
-              <w:t>Y</w:t>
+              <w:t>1</w:t>
+            </w:r>
+          </w:p>
+        </w:tc>
+        <w:tc>
+          <w:tcPr>
+            <w:tcW w:type="dxa" w:w="1337"/>
+          </w:tcPr>
+          <w:p>
+            <w:r>
+              <w:rPr>
+                <w:sz w:val="17"/>
+              </w:rPr>
+              <w:t>—</w:t>
             </w:r>
           </w:p>
         </w:tc>
@@ -2794,19 +2376,6 @@
             </w:r>
           </w:p>
         </w:tc>
-        <w:tc>
-          <w:tcPr>
-            <w:tcW w:type="dxa" w:w="1337"/>
-          </w:tcPr>
-          <w:p>
-            <w:r>
-              <w:rPr>
-                <w:sz w:val="17"/>
-              </w:rPr>
-              <w:t>OK</w:t>
-            </w:r>
-          </w:p>
-        </w:tc>
       </w:tr>
       <w:tr>
         <w:tc>
@@ -2818,7 +2387,7 @@
               <w:rPr>
                 <w:sz w:val="17"/>
               </w:rPr>
-              <w:t>LADA_Natural_History</w:t>
+              <w:t>LADA_Natural_History.html</w:t>
             </w:r>
           </w:p>
         </w:tc>
@@ -2831,7 +2400,7 @@
               <w:rPr>
                 <w:sz w:val="17"/>
               </w:rPr>
-              <w:t>60.2</w:t>
+              <w:t>60</w:t>
             </w:r>
           </w:p>
         </w:tc>
@@ -2857,7 +2426,7 @@
               <w:rPr>
                 <w:sz w:val="17"/>
               </w:rPr>
-              <w:t>Y</w:t>
+              <w:t>1</w:t>
             </w:r>
           </w:p>
         </w:tc>
@@ -2870,7 +2439,20 @@
               <w:rPr>
                 <w:sz w:val="17"/>
               </w:rPr>
-              <w:t>Y</w:t>
+              <w:t>1</w:t>
+            </w:r>
+          </w:p>
+        </w:tc>
+        <w:tc>
+          <w:tcPr>
+            <w:tcW w:type="dxa" w:w="1337"/>
+          </w:tcPr>
+          <w:p>
+            <w:r>
+              <w:rPr>
+                <w:sz w:val="17"/>
+              </w:rPr>
+              <w:t>—</w:t>
             </w:r>
           </w:p>
         </w:tc>
@@ -2886,19 +2468,6 @@
             </w:r>
           </w:p>
         </w:tc>
-        <w:tc>
-          <w:tcPr>
-            <w:tcW w:type="dxa" w:w="1337"/>
-          </w:tcPr>
-          <w:p>
-            <w:r>
-              <w:rPr>
-                <w:sz w:val="17"/>
-              </w:rPr>
-              <w:t>OK</w:t>
-            </w:r>
-          </w:p>
-        </w:tc>
       </w:tr>
       <w:tr>
         <w:tc>
@@ -2910,7 +2479,7 @@
               <w:rPr>
                 <w:sz w:val="17"/>
               </w:rPr>
-              <w:t>LADA_Prevalence</w:t>
+              <w:t>LADA_Prevalence.html</w:t>
             </w:r>
           </w:p>
         </w:tc>
@@ -2923,7 +2492,7 @@
               <w:rPr>
                 <w:sz w:val="17"/>
               </w:rPr>
-              <w:t>54.5</w:t>
+              <w:t>54</w:t>
             </w:r>
           </w:p>
         </w:tc>
@@ -2949,7 +2518,7 @@
               <w:rPr>
                 <w:sz w:val="17"/>
               </w:rPr>
-              <w:t>Y</w:t>
+              <w:t>1</w:t>
             </w:r>
           </w:p>
         </w:tc>
@@ -2962,7 +2531,21 @@
               <w:rPr>
                 <w:sz w:val="17"/>
               </w:rPr>
-              <w:t>Y</w:t>
+              <w:t>1</w:t>
+            </w:r>
+          </w:p>
+        </w:tc>
+        <w:tc>
+          <w:tcPr>
+            <w:tcW w:type="dxa" w:w="1337"/>
+            <w:shd w:val="clear" w:color="auto" w:fill="F5E1B8"/>
+          </w:tcPr>
+          <w:p>
+            <w:r>
+              <w:rPr>
+                <w:sz w:val="17"/>
+              </w:rPr>
+              <w:t>MED</w:t>
             </w:r>
           </w:p>
         </w:tc>
@@ -2975,20 +2558,7 @@
               <w:rPr>
                 <w:sz w:val="17"/>
               </w:rPr>
-              <w:t>2 unique PMIDs; 2/2 tables lack &lt;thead&gt;</w:t>
-            </w:r>
-          </w:p>
-        </w:tc>
-        <w:tc>
-          <w:tcPr>
-            <w:tcW w:type="dxa" w:w="1337"/>
-          </w:tcPr>
-          <w:p>
-            <w:r>
-              <w:rPr>
-                <w:sz w:val="17"/>
-              </w:rPr>
-              <w:t>MED</w:t>
+              <w:t>&lt;3 PMIDs visible; 2 of 2 tables without &lt;thead&gt;</w:t>
             </w:r>
           </w:p>
         </w:tc>
@@ -3003,7 +2573,7 @@
               <w:rPr>
                 <w:sz w:val="17"/>
               </w:rPr>
-              <w:t>Medical_Data_Dictionary</w:t>
+              <w:t>Medical_Data_Dictionary.html</w:t>
             </w:r>
           </w:p>
         </w:tc>
@@ -3016,7 +2586,7 @@
               <w:rPr>
                 <w:sz w:val="17"/>
               </w:rPr>
-              <w:t>358.5</w:t>
+              <w:t>358</w:t>
             </w:r>
           </w:p>
         </w:tc>
@@ -3042,7 +2612,7 @@
               <w:rPr>
                 <w:sz w:val="17"/>
               </w:rPr>
-              <w:t>Y</w:t>
+              <w:t>1</w:t>
             </w:r>
           </w:p>
         </w:tc>
@@ -3055,7 +2625,20 @@
               <w:rPr>
                 <w:sz w:val="17"/>
               </w:rPr>
-              <w:t>Y</w:t>
+              <w:t>1</w:t>
+            </w:r>
+          </w:p>
+        </w:tc>
+        <w:tc>
+          <w:tcPr>
+            <w:tcW w:type="dxa" w:w="1337"/>
+          </w:tcPr>
+          <w:p>
+            <w:r>
+              <w:rPr>
+                <w:sz w:val="17"/>
+              </w:rPr>
+              <w:t>—</w:t>
             </w:r>
           </w:p>
         </w:tc>
@@ -3071,19 +2654,6 @@
             </w:r>
           </w:p>
         </w:tc>
-        <w:tc>
-          <w:tcPr>
-            <w:tcW w:type="dxa" w:w="1337"/>
-          </w:tcPr>
-          <w:p>
-            <w:r>
-              <w:rPr>
-                <w:sz w:val="17"/>
-              </w:rPr>
-              <w:t>OK</w:t>
-            </w:r>
-          </w:p>
-        </w:tc>
       </w:tr>
       <w:tr>
         <w:tc>
@@ -3095,7 +2665,7 @@
               <w:rPr>
                 <w:sz w:val="17"/>
               </w:rPr>
-              <w:t>Methodology</w:t>
+              <w:t>Methodology.html</w:t>
             </w:r>
           </w:p>
         </w:tc>
@@ -3108,7 +2678,7 @@
               <w:rPr>
                 <w:sz w:val="17"/>
               </w:rPr>
-              <w:t>65.4</w:t>
+              <w:t>65</w:t>
             </w:r>
           </w:p>
         </w:tc>
@@ -3134,7 +2704,7 @@
               <w:rPr>
                 <w:sz w:val="17"/>
               </w:rPr>
-              <w:t>Y</w:t>
+              <w:t>1</w:t>
             </w:r>
           </w:p>
         </w:tc>
@@ -3147,20 +2717,7 @@
               <w:rPr>
                 <w:sz w:val="17"/>
               </w:rPr>
-              <w:t>Y</w:t>
-            </w:r>
-          </w:p>
-        </w:tc>
-        <w:tc>
-          <w:tcPr>
-            <w:tcW w:type="dxa" w:w="1337"/>
-          </w:tcPr>
-          <w:p>
-            <w:r>
-              <w:rPr>
-                <w:sz w:val="17"/>
-              </w:rPr>
-              <w:t>No PMIDs (reference dashboard); empty PubMed href (didactic)</w:t>
+              <w:t>1</w:t>
             </w:r>
           </w:p>
         </w:tc>
@@ -3177,6 +2734,19 @@
             </w:r>
           </w:p>
         </w:tc>
+        <w:tc>
+          <w:tcPr>
+            <w:tcW w:type="dxa" w:w="1337"/>
+          </w:tcPr>
+          <w:p>
+            <w:r>
+              <w:rPr>
+                <w:sz w:val="17"/>
+              </w:rPr>
+              <w:t>0 PMIDs (intentional — reference dashboard)</w:t>
+            </w:r>
+          </w:p>
+        </w:tc>
       </w:tr>
       <w:tr>
         <w:tc>
@@ -3188,7 +2758,7 @@
               <w:rPr>
                 <w:sz w:val="17"/>
               </w:rPr>
-              <w:t>Nutrition_Beta_Cells</w:t>
+              <w:t>Nutrition_Beta_Cells.html</w:t>
             </w:r>
           </w:p>
         </w:tc>
@@ -3201,7 +2771,7 @@
               <w:rPr>
                 <w:sz w:val="17"/>
               </w:rPr>
-              <w:t>44.9</w:t>
+              <w:t>44</w:t>
             </w:r>
           </w:p>
         </w:tc>
@@ -3227,7 +2797,7 @@
               <w:rPr>
                 <w:sz w:val="17"/>
               </w:rPr>
-              <w:t>Y</w:t>
+              <w:t>1</w:t>
             </w:r>
           </w:p>
         </w:tc>
@@ -3240,7 +2810,20 @@
               <w:rPr>
                 <w:sz w:val="17"/>
               </w:rPr>
-              <w:t>Y</w:t>
+              <w:t>1</w:t>
+            </w:r>
+          </w:p>
+        </w:tc>
+        <w:tc>
+          <w:tcPr>
+            <w:tcW w:type="dxa" w:w="1337"/>
+          </w:tcPr>
+          <w:p>
+            <w:r>
+              <w:rPr>
+                <w:sz w:val="17"/>
+              </w:rPr>
+              <w:t>—</w:t>
             </w:r>
           </w:p>
         </w:tc>
@@ -3256,19 +2839,6 @@
             </w:r>
           </w:p>
         </w:tc>
-        <w:tc>
-          <w:tcPr>
-            <w:tcW w:type="dxa" w:w="1337"/>
-          </w:tcPr>
-          <w:p>
-            <w:r>
-              <w:rPr>
-                <w:sz w:val="17"/>
-              </w:rPr>
-              <w:t>OK</w:t>
-            </w:r>
-          </w:p>
-        </w:tc>
       </w:tr>
       <w:tr>
         <w:tc>
@@ -3280,7 +2850,7 @@
               <w:rPr>
                 <w:sz w:val="17"/>
               </w:rPr>
-              <w:t>Nutrition_LADA</w:t>
+              <w:t>Nutrition_LADA.html</w:t>
             </w:r>
           </w:p>
         </w:tc>
@@ -3293,7 +2863,7 @@
               <w:rPr>
                 <w:sz w:val="17"/>
               </w:rPr>
-              <w:t>54.7</w:t>
+              <w:t>54</w:t>
             </w:r>
           </w:p>
         </w:tc>
@@ -3319,7 +2889,7 @@
               <w:rPr>
                 <w:sz w:val="17"/>
               </w:rPr>
-              <w:t>Y</w:t>
+              <w:t>1</w:t>
             </w:r>
           </w:p>
         </w:tc>
@@ -3332,7 +2902,20 @@
               <w:rPr>
                 <w:sz w:val="17"/>
               </w:rPr>
-              <w:t>Y</w:t>
+              <w:t>1</w:t>
+            </w:r>
+          </w:p>
+        </w:tc>
+        <w:tc>
+          <w:tcPr>
+            <w:tcW w:type="dxa" w:w="1337"/>
+          </w:tcPr>
+          <w:p>
+            <w:r>
+              <w:rPr>
+                <w:sz w:val="17"/>
+              </w:rPr>
+              <w:t>—</w:t>
             </w:r>
           </w:p>
         </w:tc>
@@ -3348,19 +2931,6 @@
             </w:r>
           </w:p>
         </w:tc>
-        <w:tc>
-          <w:tcPr>
-            <w:tcW w:type="dxa" w:w="1337"/>
-          </w:tcPr>
-          <w:p>
-            <w:r>
-              <w:rPr>
-                <w:sz w:val="17"/>
-              </w:rPr>
-              <w:t>OK</w:t>
-            </w:r>
-          </w:p>
-        </w:tc>
       </w:tr>
       <w:tr>
         <w:tc>
@@ -3372,7 +2942,7 @@
               <w:rPr>
                 <w:sz w:val="17"/>
               </w:rPr>
-              <w:t>PMID_Verification</w:t>
+              <w:t>PMID_Verification.html</w:t>
             </w:r>
           </w:p>
         </w:tc>
@@ -3385,7 +2955,7 @@
               <w:rPr>
                 <w:sz w:val="17"/>
               </w:rPr>
-              <w:t>171.0</w:t>
+              <w:t>171</w:t>
             </w:r>
           </w:p>
         </w:tc>
@@ -3411,7 +2981,7 @@
               <w:rPr>
                 <w:sz w:val="17"/>
               </w:rPr>
-              <w:t>Y</w:t>
+              <w:t>1</w:t>
             </w:r>
           </w:p>
         </w:tc>
@@ -3424,7 +2994,7 @@
               <w:rPr>
                 <w:sz w:val="17"/>
               </w:rPr>
-              <w:t>Y</w:t>
+              <w:t>1</w:t>
             </w:r>
           </w:p>
         </w:tc>
@@ -3437,7 +3007,7 @@
               <w:rPr>
                 <w:sz w:val="17"/>
               </w:rPr>
-              <w:t>Placeholder PMID 12345678 (calibration row)</w:t>
+              <w:t>—</w:t>
             </w:r>
           </w:p>
         </w:tc>
@@ -3450,7 +3020,6 @@
               <w:rPr>
                 <w:sz w:val="17"/>
               </w:rPr>
-              <w:t>LOW</w:t>
             </w:r>
           </w:p>
         </w:tc>
@@ -3465,7 +3034,7 @@
               <w:rPr>
                 <w:sz w:val="17"/>
               </w:rPr>
-              <w:t>Paper_Library</w:t>
+              <w:t>Paper_Library.html</w:t>
             </w:r>
           </w:p>
         </w:tc>
@@ -3478,7 +3047,7 @@
               <w:rPr>
                 <w:sz w:val="17"/>
               </w:rPr>
-              <w:t>200.0</w:t>
+              <w:t>199</w:t>
             </w:r>
           </w:p>
         </w:tc>
@@ -3504,7 +3073,7 @@
               <w:rPr>
                 <w:sz w:val="17"/>
               </w:rPr>
-              <w:t>Y</w:t>
+              <w:t>1</w:t>
             </w:r>
           </w:p>
         </w:tc>
@@ -3517,7 +3086,7 @@
               <w:rPr>
                 <w:sz w:val="17"/>
               </w:rPr>
-              <w:t>Y</w:t>
+              <w:t>1</w:t>
             </w:r>
           </w:p>
         </w:tc>
@@ -3530,7 +3099,7 @@
               <w:rPr>
                 <w:sz w:val="17"/>
               </w:rPr>
-              <w:t>Placeholder PMID 12345678 (calibration row)</w:t>
+              <w:t>—</w:t>
             </w:r>
           </w:p>
         </w:tc>
@@ -3543,7 +3112,6 @@
               <w:rPr>
                 <w:sz w:val="17"/>
               </w:rPr>
-              <w:t>LOW</w:t>
             </w:r>
           </w:p>
         </w:tc>
@@ -3558,7 +3126,7 @@
               <w:rPr>
                 <w:sz w:val="17"/>
               </w:rPr>
-              <w:t>Research_Dashboard</w:t>
+              <w:t>Research_Dashboard.html</w:t>
             </w:r>
           </w:p>
         </w:tc>
@@ -3571,7 +3139,7 @@
               <w:rPr>
                 <w:sz w:val="17"/>
               </w:rPr>
-              <w:t>65.6</w:t>
+              <w:t>65</w:t>
             </w:r>
           </w:p>
         </w:tc>
@@ -3597,7 +3165,7 @@
               <w:rPr>
                 <w:sz w:val="17"/>
               </w:rPr>
-              <w:t>Y</w:t>
+              <w:t>1</w:t>
             </w:r>
           </w:p>
         </w:tc>
@@ -3610,7 +3178,20 @@
               <w:rPr>
                 <w:sz w:val="17"/>
               </w:rPr>
-              <w:t>Y</w:t>
+              <w:t>1</w:t>
+            </w:r>
+          </w:p>
+        </w:tc>
+        <w:tc>
+          <w:tcPr>
+            <w:tcW w:type="dxa" w:w="1337"/>
+          </w:tcPr>
+          <w:p>
+            <w:r>
+              <w:rPr>
+                <w:sz w:val="17"/>
+              </w:rPr>
+              <w:t>—</w:t>
             </w:r>
           </w:p>
         </w:tc>
@@ -3626,19 +3207,6 @@
             </w:r>
           </w:p>
         </w:tc>
-        <w:tc>
-          <w:tcPr>
-            <w:tcW w:type="dxa" w:w="1337"/>
-          </w:tcPr>
-          <w:p>
-            <w:r>
-              <w:rPr>
-                <w:sz w:val="17"/>
-              </w:rPr>
-              <w:t>OK</w:t>
-            </w:r>
-          </w:p>
-        </w:tc>
       </w:tr>
       <w:tr>
         <w:tc>
@@ -3650,7 +3218,7 @@
               <w:rPr>
                 <w:sz w:val="17"/>
               </w:rPr>
-              <w:t>Research_Paths</w:t>
+              <w:t>Research_Paths.html</w:t>
             </w:r>
           </w:p>
         </w:tc>
@@ -3663,7 +3231,7 @@
               <w:rPr>
                 <w:sz w:val="17"/>
               </w:rPr>
-              <w:t>129.4</w:t>
+              <w:t>129</w:t>
             </w:r>
           </w:p>
         </w:tc>
@@ -3689,7 +3257,7 @@
               <w:rPr>
                 <w:sz w:val="17"/>
               </w:rPr>
-              <w:t>Y</w:t>
+              <w:t>1</w:t>
             </w:r>
           </w:p>
         </w:tc>
@@ -3702,7 +3270,20 @@
               <w:rPr>
                 <w:sz w:val="17"/>
               </w:rPr>
-              <w:t>Y</w:t>
+              <w:t>1</w:t>
+            </w:r>
+          </w:p>
+        </w:tc>
+        <w:tc>
+          <w:tcPr>
+            <w:tcW w:type="dxa" w:w="1337"/>
+          </w:tcPr>
+          <w:p>
+            <w:r>
+              <w:rPr>
+                <w:sz w:val="17"/>
+              </w:rPr>
+              <w:t>—</w:t>
             </w:r>
           </w:p>
         </w:tc>
@@ -3718,19 +3299,6 @@
             </w:r>
           </w:p>
         </w:tc>
-        <w:tc>
-          <w:tcPr>
-            <w:tcW w:type="dxa" w:w="1337"/>
-          </w:tcPr>
-          <w:p>
-            <w:r>
-              <w:rPr>
-                <w:sz w:val="17"/>
-              </w:rPr>
-              <w:t>OK</w:t>
-            </w:r>
-          </w:p>
-        </w:tc>
       </w:tr>
       <w:tr>
         <w:tc>
@@ -3742,7 +3310,7 @@
               <w:rPr>
                 <w:sz w:val="17"/>
               </w:rPr>
-              <w:t>Statistical_Analysis</w:t>
+              <w:t>Statistical_Analysis.html</w:t>
             </w:r>
           </w:p>
         </w:tc>
@@ -3755,7 +3323,7 @@
               <w:rPr>
                 <w:sz w:val="17"/>
               </w:rPr>
-              <w:t>37.3</w:t>
+              <w:t>37</w:t>
             </w:r>
           </w:p>
         </w:tc>
@@ -3781,7 +3349,7 @@
               <w:rPr>
                 <w:sz w:val="17"/>
               </w:rPr>
-              <w:t>Y</w:t>
+              <w:t>1</w:t>
             </w:r>
           </w:p>
         </w:tc>
@@ -3794,7 +3362,20 @@
               <w:rPr>
                 <w:sz w:val="17"/>
               </w:rPr>
-              <w:t>Y</w:t>
+              <w:t>1</w:t>
+            </w:r>
+          </w:p>
+        </w:tc>
+        <w:tc>
+          <w:tcPr>
+            <w:tcW w:type="dxa" w:w="1337"/>
+          </w:tcPr>
+          <w:p>
+            <w:r>
+              <w:rPr>
+                <w:sz w:val="17"/>
+              </w:rPr>
+              <w:t>—</w:t>
             </w:r>
           </w:p>
         </w:tc>
@@ -3810,19 +3391,6 @@
             </w:r>
           </w:p>
         </w:tc>
-        <w:tc>
-          <w:tcPr>
-            <w:tcW w:type="dxa" w:w="1337"/>
-          </w:tcPr>
-          <w:p>
-            <w:r>
-              <w:rPr>
-                <w:sz w:val="17"/>
-              </w:rPr>
-              <w:t>OK</w:t>
-            </w:r>
-          </w:p>
-        </w:tc>
       </w:tr>
       <w:tr>
         <w:tc>
@@ -3834,7 +3402,7 @@
               <w:rPr>
                 <w:sz w:val="17"/>
               </w:rPr>
-              <w:t>Treg_Neuropathy</w:t>
+              <w:t>Treg_Neuropathy.html</w:t>
             </w:r>
           </w:p>
         </w:tc>
@@ -3847,7 +3415,7 @@
               <w:rPr>
                 <w:sz w:val="17"/>
               </w:rPr>
-              <w:t>68.4</w:t>
+              <w:t>68</w:t>
             </w:r>
           </w:p>
         </w:tc>
@@ -3873,7 +3441,7 @@
               <w:rPr>
                 <w:sz w:val="17"/>
               </w:rPr>
-              <w:t>Y</w:t>
+              <w:t>1</w:t>
             </w:r>
           </w:p>
         </w:tc>
@@ -3886,7 +3454,21 @@
               <w:rPr>
                 <w:sz w:val="17"/>
               </w:rPr>
-              <w:t>Y</w:t>
+              <w:t>1</w:t>
+            </w:r>
+          </w:p>
+        </w:tc>
+        <w:tc>
+          <w:tcPr>
+            <w:tcW w:type="dxa" w:w="1337"/>
+            <w:shd w:val="clear" w:color="auto" w:fill="F5F0D8"/>
+          </w:tcPr>
+          <w:p>
+            <w:r>
+              <w:rPr>
+                <w:sz w:val="17"/>
+              </w:rPr>
+              <w:t>LOW</w:t>
             </w:r>
           </w:p>
         </w:tc>
@@ -3899,20 +3481,7 @@
               <w:rPr>
                 <w:sz w:val="17"/>
               </w:rPr>
-              <w:t>2/2 tables lack &lt;thead&gt;</w:t>
-            </w:r>
-          </w:p>
-        </w:tc>
-        <w:tc>
-          <w:tcPr>
-            <w:tcW w:type="dxa" w:w="1337"/>
-          </w:tcPr>
-          <w:p>
-            <w:r>
-              <w:rPr>
-                <w:sz w:val="17"/>
-              </w:rPr>
-              <w:t>LOW</w:t>
+              <w:t>2 of 2 tables emitted without &lt;thead&gt;</w:t>
             </w:r>
           </w:p>
         </w:tc>
@@ -3927,7 +3496,7 @@
               <w:rPr>
                 <w:sz w:val="17"/>
               </w:rPr>
-              <w:t>Trial_Equity_Mapper</w:t>
+              <w:t>Trial_Equity_Mapper.html</w:t>
             </w:r>
           </w:p>
         </w:tc>
@@ -3940,7 +3509,7 @@
               <w:rPr>
                 <w:sz w:val="17"/>
               </w:rPr>
-              <w:t>73.5</w:t>
+              <w:t>73</w:t>
             </w:r>
           </w:p>
         </w:tc>
@@ -3966,7 +3535,7 @@
               <w:rPr>
                 <w:sz w:val="17"/>
               </w:rPr>
-              <w:t>Y</w:t>
+              <w:t>1</w:t>
             </w:r>
           </w:p>
         </w:tc>
@@ -3979,7 +3548,20 @@
               <w:rPr>
                 <w:sz w:val="17"/>
               </w:rPr>
-              <w:t>Y</w:t>
+              <w:t>1</w:t>
+            </w:r>
+          </w:p>
+        </w:tc>
+        <w:tc>
+          <w:tcPr>
+            <w:tcW w:type="dxa" w:w="1337"/>
+          </w:tcPr>
+          <w:p>
+            <w:r>
+              <w:rPr>
+                <w:sz w:val="17"/>
+              </w:rPr>
+              <w:t>—</w:t>
             </w:r>
           </w:p>
         </w:tc>
@@ -3995,882 +3577,438 @@
             </w:r>
           </w:p>
         </w:tc>
-        <w:tc>
-          <w:tcPr>
-            <w:tcW w:type="dxa" w:w="1337"/>
-          </w:tcPr>
-          <w:p>
-            <w:r>
-              <w:rPr>
-                <w:sz w:val="17"/>
-              </w:rPr>
-              <w:t>OK</w:t>
-            </w:r>
-          </w:p>
-        </w:tc>
       </w:tr>
     </w:tbl>
-    <w:p/>
+    <w:p>
+      <w:r>
+        <w:br w:type="page"/>
+      </w:r>
+    </w:p>
     <w:p>
       <w:pPr>
         <w:pStyle w:val="Heading1"/>
       </w:pPr>
       <w:r>
+        <w:rPr>
+          <w:rFonts w:ascii="Georgia" w:hAnsi="Georgia"/>
+          <w:color w:val="1A1A1A"/>
+        </w:rPr>
         <w:t>Detailed Findings</w:t>
       </w:r>
     </w:p>
     <w:p>
       <w:pPr>
         <w:pStyle w:val="Heading2"/>
-        <w:spacing w:before="280"/>
       </w:pPr>
       <w:r>
+        <w:rPr>
+          <w:rFonts w:ascii="Georgia" w:hAnsi="Georgia"/>
+          <w:color w:val="1A1A1A"/>
+        </w:rPr>
         <w:t>1. Navigation and UX Consistency</w:t>
       </w:r>
     </w:p>
     <w:p>
       <w:pPr>
         <w:pStyle w:val="Heading3"/>
-        <w:spacing w:before="200"/>
       </w:pPr>
       <w:r>
+        <w:rPr>
+          <w:rFonts w:ascii="Georgia" w:hAnsi="Georgia"/>
+          <w:color w:val="1A1A1A"/>
+        </w:rPr>
         <w:t>Working copy (Dashboards/)</w:t>
       </w:r>
     </w:p>
     <w:p>
       <w:r>
-        <w:rPr>
-          <w:b w:val="0"/>
-          <w:i w:val="0"/>
-        </w:rPr>
-        <w:t>All 34 dashboards in the working copy carry a &lt;nav&gt; element and a back-link to either ../docs/index.html or to the local Diabetes Research Hub label. Methodology.html again carries the densest cross-link set (16 hub/back references). Static scan finds zero working-copy dashboards missing navigation.</w:t>
+        <w:t>All 34 dashboards in the working copy carry the &lt;nav class="drh-nav"&gt; element added by postprocess_dashboards.py and a back-link of the form href="../docs/index.html" → Hub. The post-processing log from this cycle confirms 'Processed 34 dashboards, 34 modified'. Static scan finds zero working-copy dashboards missing navigation or back-links. Cross-link density is uniform: each nav exposes a grouped dropdown with all 34 sibling dashboards visible.</w:t>
       </w:r>
     </w:p>
     <w:p>
       <w:pPr>
         <w:pStyle w:val="Heading3"/>
-        <w:spacing w:before="200"/>
       </w:pPr>
       <w:r>
+        <w:rPr>
+          <w:rFonts w:ascii="Georgia" w:hAnsi="Georgia"/>
+          <w:color w:val="1A1A1A"/>
+        </w:rPr>
         <w:t>Published mirror (docs/Dashboards/)</w:t>
       </w:r>
     </w:p>
     <w:p>
       <w:r>
-        <w:rPr>
-          <w:b w:val="0"/>
-          <w:i w:val="0"/>
-        </w:rPr>
-        <w:t>The mirror remains one dashboard short of the working copy. docs/Dashboards/Islet_Drug_Repurposing.html does not exist; the landing page links to it; the deployed GitHub Pages site returns 404 for the "Islet Drug Repurposing Pipeline" card. The working copy carries the file at 115.6 KB with 5 unique PMIDs visible to static scan and complete nav/back-link markup. This is the third consecutive weekly audit to flag the gap. Fix is a one-line cp in the deploy step.</w:t>
+        <w:t>New finding this week. The mirror is not 'one dashboard short' as previously characterized — it is wholly stale. All 33 files in docs/Dashboards/ are dated 2026-03-29 14:14, predating the introduction of the drh-nav post-processing step entirely. Zero of the 33 mirror dashboards contain the drh-nav class; all 34 working-copy dashboards do. The deployment step that should copy /Dashboards/*.html → /docs/Dashboards/*.html has either silently failed, been removed, or was never wired up after the post-processing pipeline was introduced. refresh_hub.py contains no reference to docs/ or any sync/copy step targeting docs/Dashboards/.</w:t>
+      </w:r>
+    </w:p>
+    <w:p>
+      <w:r>
+        <w:t>User-visible impact: every navigation improvement, every ARIA addition, every PMID hyperlink injection of the past two months is invisible on the deployed GitHub Pages site. Visitors see the March 29 versions with no nav bars, no back-links, and incomplete citation linking. The 'live' Tufte landing page at docs/index.html, by contrast, has been refreshed this morning (2026-05-31) — the landing page updates cleanly, but the artifacts it links to are frozen in March.</w:t>
       </w:r>
     </w:p>
     <w:p>
       <w:pPr>
         <w:pStyle w:val="Heading3"/>
-        <w:spacing w:before="200"/>
       </w:pPr>
       <w:r>
+        <w:rPr>
+          <w:rFonts w:ascii="Georgia" w:hAnsi="Georgia"/>
+          <w:color w:val="1A1A1A"/>
+        </w:rPr>
         <w:t>Landing page link resolution</w:t>
       </w:r>
     </w:p>
     <w:p>
       <w:r>
-        <w:rPr>
-          <w:b w:val="0"/>
-          <w:i w:val="0"/>
-        </w:rPr>
-        <w:t>docs/index.html lists 34 dashboards; all 34 hrefs match files in Dashboards/. 33 of 34 hrefs resolve in docs/Dashboards/. The one broken mirror link is the Islet_Drug_Repurposing case above. Footer date string reads "Last updated: 2026-05-24", which matches today's audit date — the landing page itself is fresh.</w:t>
+        <w:t>docs/index.html lists 34 dashboards. 34 of 34 hrefs resolve against the working copy Dashboards/. 33 of 34 resolve against docs/Dashboards/. The one broken mirror link is the recurring Dashboards/Islet_Drug_Repurposing.html — the working copy has it at 115.6 KB, the mirror does not.</w:t>
       </w:r>
     </w:p>
     <w:p>
       <w:pPr>
         <w:pStyle w:val="Heading2"/>
-        <w:spacing w:before="280"/>
       </w:pPr>
       <w:r>
+        <w:rPr>
+          <w:rFonts w:ascii="Georgia" w:hAnsi="Georgia"/>
+          <w:color w:val="1A1A1A"/>
+        </w:rPr>
         <w:t>2. Research Validity and Citation Completeness</w:t>
       </w:r>
     </w:p>
     <w:p>
       <w:pPr>
         <w:pStyle w:val="Heading3"/>
-        <w:spacing w:before="200"/>
       </w:pPr>
       <w:r>
+        <w:rPr>
+          <w:rFonts w:ascii="Georgia" w:hAnsi="Georgia"/>
+          <w:color w:val="1A1A1A"/>
+        </w:rPr>
         <w:t>PMID coverage</w:t>
       </w:r>
     </w:p>
     <w:p>
       <w:r>
-        <w:rPr>
-          <w:b w:val="0"/>
-          <w:i w:val="0"/>
-        </w:rPr>
-        <w:t>259 unique PubMed IDs are referenced from Paper_Library.html and PMID_Verification.html — the two canonical citation registries — unchanged from May 17. Across the remaining 32 dashboards, PMID counts visible to static scans range from 0 (Acronym_Database, Methodology — both reference dashboards, intentional) to 90 (Medical_Data_Dictionary). 29 of 34 dashboards carry at least 3 unique PMIDs at static scan.</w:t>
-      </w:r>
-    </w:p>
-    <w:p>
-      <w:r>
-        <w:rPr>
-          <w:b w:val="0"/>
-          <w:i w:val="0"/>
-        </w:rPr>
-        <w:t>Dashboards below the &lt; 3 threshold: Generic_Drug_Catalog (2 visible; runtime JavaScript injects more), LADA_Prevalence (2 unique), and the two reference dashboards (0 each, by design). Islet_Transplant_Analysis sits at exactly 3 — borderline but compliant.</w:t>
+        <w:t>186 unique numeric PMIDs are referenced across the working-copy dashboards. PMID_Verification.html and Paper_Library.html remain the two canonical citation registries, with 259 PMIDs each. Across the remaining 32 dashboards, PMID counts visible to static scan range from 0 (Acronym_Database, Methodology — both intentional, reference dashboards by design) to 90 (Medical_Data_Dictionary). 30 of 34 dashboards carry at least 3 unique PMIDs at static scan. Two fall below the &lt; 3 threshold and are flagged MEDIUM: Generic_Drug_Catalog (2 visible; runtime JS injects more but they leak as malformed hrefs — see below) and LADA_Prevalence (2 unique).</w:t>
       </w:r>
     </w:p>
     <w:p>
       <w:pPr>
         <w:pStyle w:val="Heading3"/>
-        <w:spacing w:before="200"/>
       </w:pPr>
       <w:r>
-        <w:t>Placeholder and suspicious PMIDs</w:t>
-      </w:r>
-    </w:p>
-    <w:p>
-      <w:r>
         <w:rPr>
-          <w:b w:val="0"/>
-          <w:i w:val="0"/>
+          <w:rFonts w:ascii="Georgia" w:hAnsi="Georgia"/>
+          <w:color w:val="1A1A1A"/>
         </w:rPr>
-        <w:t>PMID 12345678 — a sequential placeholder pattern — still appears in Paper_Library.html and PMID_Verification.html. Both rows are flagged MISMATCH in the data and paired with the same paper title ("Denpasar Declaration on Population and Development", a 1994 Integration journal entry). These are known calibration rows for the CONFIRMED/PLAUSIBLE/WEAK/MISMATCH scoring system, not oversights. Recommendation from prior audits (add a visible "calibration row" disclosure note) is still not implemented.</w:t>
-      </w:r>
-    </w:p>
-    <w:p>
-      <w:r>
-        <w:rPr>
-          <w:b w:val="0"/>
-          <w:i w:val="0"/>
-        </w:rPr>
-        <w:t>No evidence of cross-dashboard PMID misattribution — spot-checks of high-frequency PMIDs in Gap_Deep_Dives, CART_Access_Barriers, and Extracted_Evidence showed only label variants (e.g., "PMID:29710129" vs "[PMID:29710129]") rather than different paper titles attached to the same ID.</w:t>
-      </w:r>
-    </w:p>
-    <w:p>
-      <w:pPr>
-        <w:pStyle w:val="Heading3"/>
-        <w:spacing w:before="200"/>
-      </w:pPr>
-      <w:r>
         <w:t>Malformed PubMed hyperlinks</w:t>
       </w:r>
     </w:p>
     <w:p>
       <w:r>
-        <w:rPr>
-          <w:b w:val="0"/>
-          <w:i w:val="0"/>
-        </w:rPr>
-        <w:t>Three dashboards still contain hrefs that do not match the canonical https://pubmed.ncbi.nlm.nih.gov/&lt;digits&gt;/ form — same set as last week, no progress:</w:t>
+        <w:t>Three dashboards still contain hrefs that do not match the canonical https://pubmed.ncbi.nlm.nih.gov/&lt;digits&gt;/ form — same set as the May 17 and May 24 audits, no progress this week:</w:t>
       </w:r>
     </w:p>
     <w:p>
-      <w:pPr>
-        <w:pStyle w:val="ListBullet"/>
-        <w:spacing w:after="40"/>
-      </w:pPr>
       <w:r>
-        <w:t>Drug_Repurposing_Islet.html — 7 hrefs of the form pubmed.ncbi.nlm.nih.gov/&lt;sentence&gt; (observed: "BANDIT trial", "Clinical data in T2D", "Emerging transplant data", "NCT01319331", three variants of "Mechanistic rationale (no islet transplant clinical data)"). These render as broken external links.</w:t>
+        <w:t>Drug_Repurposing_Islet.html — 7 hrefs of the form pubmed.ncbi.nlm.nih.gov/&lt;sentence&gt; (observed: 'BANDIT trial', 'Clinical data in T2D', 'Emerging transplant data', 'NCT01319331', three variants of 'Mechanistic rationale (no islet transplant clinical data)'). These render as broken external links to any user who clicks them. Root cause is in build_drug_repurposing_islet.py, which appears to pass annotation text into the same template slot that elsewhere receives a numeric PMID.</w:t>
       </w:r>
     </w:p>
     <w:p>
-      <w:pPr>
-        <w:pStyle w:val="ListBullet"/>
-        <w:spacing w:after="40"/>
-      </w:pPr>
       <w:r>
-        <w:t>Generic_Drug_Catalog.html — 2 leaks of the JavaScript template literal pubmed.ncbi.nlm.nih.gov/' + p.trim() + '/. Works at runtime; trips static scanners.</w:t>
+        <w:t>Generic_Drug_Catalog.html — 2 static href values contain the literal pubmed.ncbi.nlm.nih.gov/' + p.trim() + '/ — the JavaScript template literal was concatenated as a string rather than interpolated. Works at runtime; trips every static link checker and external auditor.</w:t>
       </w:r>
     </w:p>
     <w:p>
-      <w:pPr>
-        <w:pStyle w:val="ListBullet"/>
-        <w:spacing w:after="40"/>
-      </w:pPr>
       <w:r>
         <w:t>Methodology.html — 1 empty pubmed.ncbi.nlm.nih.gov/ href used as a didactic example of what a PMID link looks like. Cosmetic, not user-facing as broken.</w:t>
       </w:r>
     </w:p>
     <w:p>
       <w:pPr>
-        <w:pStyle w:val="Heading2"/>
-        <w:spacing w:before="280"/>
+        <w:pStyle w:val="Heading3"/>
       </w:pPr>
       <w:r>
-        <w:t>3. Build Integrity</w:t>
+        <w:rPr>
+          <w:rFonts w:ascii="Georgia" w:hAnsi="Georgia"/>
+          <w:color w:val="1A1A1A"/>
+        </w:rPr>
+        <w:t>Most-cited PMIDs (cross-dashboard reuse)</w:t>
       </w:r>
     </w:p>
     <w:p>
       <w:r>
+        <w:t>Five PMIDs appear 12 or more times across the platform: 37359825 (32), 38783768 (16), 37105208 (16), 35028608 (12), 23248199 (12). Spot-checks confirmed these high-frequency PMIDs are cited with the same paper title across dashboards — no evidence of cross-dashboard PMID misattribution this cycle. The known calibration row in Paper_Library and PMID_Verification (PMID 12345678, deliberately MISMATCH-scored) is unchanged from prior audits and remains undocumented in user-facing UI.</w:t>
+      </w:r>
+    </w:p>
+    <w:p>
+      <w:pPr>
+        <w:pStyle w:val="Heading2"/>
+      </w:pPr>
+      <w:r>
         <w:rPr>
-          <w:b w:val="0"/>
-          <w:i w:val="0"/>
+          <w:rFonts w:ascii="Georgia" w:hAnsi="Georgia"/>
+          <w:color w:val="1A1A1A"/>
         </w:rPr>
-        <w:t>This week the master runner python run_quality_improvements.py was executed end-to-end. Exit message: "1 script(s) failed. Check output above."</w:t>
+        <w:t>3. Build Integrity</w:t>
       </w:r>
     </w:p>
     <w:p>
       <w:pPr>
         <w:pStyle w:val="Heading3"/>
-        <w:spacing w:before="200"/>
       </w:pPr>
       <w:r>
-        <w:t>add_citations.py — IndentationError at line 268 (NEW THIS WEEK)</w:t>
+        <w:rPr>
+          <w:rFonts w:ascii="Georgia" w:hAnsi="Georgia"/>
+          <w:color w:val="1A1A1A"/>
+        </w:rPr>
+        <w:t>Master pipeline exit status</w:t>
       </w:r>
     </w:p>
     <w:p>
       <w:r>
-        <w:rPr>
-          <w:b w:val="0"/>
-          <w:i w:val="0"/>
-        </w:rPr>
-        <w:t>The script add_citations.py was added to the master runner sometime between the May 17 and May 24 audits. It now fails on every full build with:</w:t>
-      </w:r>
-    </w:p>
-    <w:p>
-      <w:r>
-        <w:rPr>
-          <w:b w:val="0"/>
-          <w:i/>
-          <w:color w:val="636363"/>
-        </w:rPr>
-        <w:t xml:space="preserve">    out_path = os.path.join(BASE_DIR, 'Research_Findings_Summary.md')</w:t>
-      </w:r>
-    </w:p>
-    <w:p>
-      <w:r>
-        <w:rPr>
-          <w:b w:val="0"/>
-          <w:i/>
-          <w:color w:val="636363"/>
-        </w:rPr>
-        <w:t xml:space="preserve">    IndentationError: unexpected indent (add_citations.py, line 268)</w:t>
-      </w:r>
-    </w:p>
-    <w:p>
-      <w:r>
-        <w:rPr>
-          <w:b w:val="0"/>
-          <w:i w:val="0"/>
-        </w:rPr>
-        <w:t>Root cause: lines 264-266 close out the script's main() block correctly, followed by an orphan stub "()" on line 267, and then a duplicate copy of the closing block (lines 268-274) sits at module level with 4-space indentation but no enclosing function. Likely an editor merge accident or a botched refactor. The fix is removing lines 267-274 (the orphan parentheses and the duplicated tail). The dashboards that depend on the citation block — Research_Findings_Summary.md — are now built from whatever the last clean run produced; nothing dynamic downstream is currently broken, but the build report is no longer all-green.</w:t>
+        <w:t>python run_quality_improvements.py was executed end-to-end during this audit. Exit message: 'All 41 improvements completed successfully.' All 41 scripts referenced by the master runner pass Python 3 compilation and execute without errors. This is the first all-green build since the May 17 audit.</w:t>
       </w:r>
     </w:p>
     <w:p>
       <w:pPr>
         <w:pStyle w:val="Heading3"/>
-        <w:spacing w:before="200"/>
       </w:pPr>
       <w:r>
-        <w:t>Other pipeline scripts</w:t>
+        <w:rPr>
+          <w:rFonts w:ascii="Georgia" w:hAnsi="Georgia"/>
+          <w:color w:val="1A1A1A"/>
+        </w:rPr>
+        <w:t>Closed this cycle</w:t>
       </w:r>
     </w:p>
     <w:p>
       <w:r>
-        <w:rPr>
-          <w:b w:val="0"/>
-          <w:i w:val="0"/>
-        </w:rPr>
-        <w:t>40 of 41 scripts referenced by run_quality_improvements.py pass Python 3 compilation. extract_corpus_data.py, which the May 17 audit flagged with an IndentationError at line 374, now compiles cleanly — that finding is closed. The full dashboard set regenerated successfully ("Processed 34 dashboards, 34 modified" per the post-processing step), and every individual dashboard build script reported [OK].</w:t>
+        <w:t>add_citations.py — last week's HIGH-priority IndentationError at line 268 has been resolved. py_compile is clean and the script runs to completion as part of the master pipeline. The orphan duplicate close-block has been removed.</w:t>
       </w:r>
     </w:p>
     <w:p>
       <w:pPr>
         <w:pStyle w:val="Heading3"/>
-        <w:spacing w:before="200"/>
       </w:pPr>
       <w:r>
-        <w:t>Footprint</w:t>
+        <w:rPr>
+          <w:rFonts w:ascii="Georgia" w:hAnsi="Georgia"/>
+          <w:color w:val="1A1A1A"/>
+        </w:rPr>
+        <w:t>Footprint and counts</w:t>
       </w:r>
     </w:p>
     <w:p>
       <w:r>
-        <w:rPr>
-          <w:b w:val="0"/>
-          <w:i w:val="0"/>
-        </w:rPr>
-        <w:t>Working-copy: 3.7 MB, 34 HTML files in Dashboards/. Mirror: 3.2 MB, 33 HTML files in docs/Dashboards/. The 0.5 MB delta is dominated by the missing Islet_Drug_Repurposing.html (115.6 KB) plus minor compression-incidental differences across the rest of the mirror.</w:t>
+        <w:t>Working-copy Dashboards/: 34 HTML files, ~3.7 MB. Mirror docs/Dashboards/: 33 HTML files, ~3.0 MB. The size delta reflects both the single missing file (Islet_Drug_Repurposing.html ~115 KB) and the absence of every post-processing addition (nav-bar markup, ARIA attributes, PMID hyperlink injection) across the rest of the mirror. The Clinical_Trial_Dashboard regenerates at 441 KB in the working copy versus 414 KB in the stale mirror — that 27 KB delta is mostly nav markup and added citation hyperlinks.</w:t>
       </w:r>
     </w:p>
     <w:p>
       <w:pPr>
         <w:pStyle w:val="Heading2"/>
-        <w:spacing w:before="280"/>
       </w:pPr>
       <w:r>
+        <w:rPr>
+          <w:rFonts w:ascii="Georgia" w:hAnsi="Georgia"/>
+          <w:color w:val="1A1A1A"/>
+        </w:rPr>
         <w:t>4. Content Freshness</w:t>
       </w:r>
     </w:p>
     <w:p>
       <w:pPr>
         <w:pStyle w:val="Heading3"/>
-        <w:spacing w:before="200"/>
       </w:pPr>
       <w:r>
+        <w:rPr>
+          <w:rFonts w:ascii="Georgia" w:hAnsi="Georgia"/>
+          <w:color w:val="1A1A1A"/>
+        </w:rPr>
         <w:t>Dates and timestamps</w:t>
       </w:r>
     </w:p>
     <w:p>
       <w:r>
-        <w:rPr>
-          <w:b w:val="0"/>
-          <w:i w:val="0"/>
-        </w:rPr>
-        <w:t>Landing-page footer: "Last updated: 2026-05-24" — matches today. Footer copyright line: "Diabetes Research Hub © 2026 Justin Bottum" — current.</w:t>
-      </w:r>
-    </w:p>
-    <w:p>
-      <w:r>
-        <w:rPr>
-          <w:b w:val="0"/>
-          <w:i w:val="0"/>
-        </w:rPr>
-        <w:t>GKA_Landscape.html footer still reads "Generated 2025 | SILVER Validation Status" — the string is hardcoded in build_gka_landscape.py at the footer template. This carries over from the May 17 audit unchanged. Every other dashboard either uses a runtime date or no year string.</w:t>
+        <w:t>Landing-page footer: 'Last updated: 2026-05-31' — matches today. Footer copyright: '© 2026 Justin Bottum' — current. Multiple dashboards carry 'Last updated: May 31, 2026' or 'Last updated: 2026'. The one stale year-stamp remains GKA_Landscape.html, whose footer reads 'Generated 2025 | SILVER Validation Status' — the string is hardcoded in build_gka_landscape.py at line 1211 of the rendered output. Carryover from May 17, May 24.</w:t>
       </w:r>
     </w:p>
     <w:p>
       <w:pPr>
         <w:pStyle w:val="Heading3"/>
-        <w:spacing w:before="200"/>
       </w:pPr>
       <w:r>
+        <w:rPr>
+          <w:rFonts w:ascii="Georgia" w:hAnsi="Georgia"/>
+          <w:color w:val="1A1A1A"/>
+        </w:rPr>
         <w:t>Clinical-trial count drift</w:t>
       </w:r>
     </w:p>
     <w:p>
       <w:r>
-        <w:rPr>
-          <w:b w:val="0"/>
-          <w:i w:val="0"/>
-        </w:rPr>
-        <w:t>The May 24 monitor report (Analysis/Results/monitor_report_2026-05-24.md) lists 797 unique trials, matching the landing-page headline. Surfaces in disagreement, unchanged from May 17:</w:t>
-      </w:r>
-    </w:p>
-    <w:p>
-      <w:pPr>
-        <w:pStyle w:val="ListBullet"/>
-        <w:spacing w:after="40"/>
-      </w:pPr>
-      <w:r>
-        <w:t>docs/index.html — 797 (refreshed today; was 795 last week)</w:t>
-      </w:r>
-    </w:p>
-    <w:p>
-      <w:pPr>
-        <w:pStyle w:val="ListBullet"/>
-        <w:spacing w:after="40"/>
-      </w:pPr>
-      <w:r>
-        <w:t>Dashboards/Clinical_Trial_Dashboard.html prose — "748+ diabetes clinical trials" (stale)</w:t>
-      </w:r>
-    </w:p>
-    <w:p>
-      <w:pPr>
-        <w:pStyle w:val="ListBullet"/>
-        <w:spacing w:after="40"/>
-      </w:pPr>
-      <w:r>
-        <w:t>Dashboards/Gap_Deep_Dives.html — "746-trial database" and "746 trial database entries" (stale, lines 2231 and 2299)</w:t>
-      </w:r>
-    </w:p>
-    <w:p>
-      <w:pPr>
-        <w:pStyle w:val="ListBullet"/>
-        <w:spacing w:after="40"/>
-      </w:pPr>
-      <w:r>
-        <w:t>docs/social_media_launch_posts.md — three instances of "746" (stale)</w:t>
+        <w:t>Today's canonical count (Analysis/Results/clinical_trials_latest.json) is 804 trials. The landing page reflects this in both the headline figures block and the Clinical Trial Intelligence card. Surfaces in disagreement, drift unchanged or worsened from May 24:</w:t>
       </w:r>
     </w:p>
     <w:p>
       <w:r>
-        <w:rPr>
-          <w:b w:val="0"/>
-          <w:i w:val="0"/>
-        </w:rPr>
-        <w:t>The audit task description itself was updated this cycle to read 746; it is now the only place 746 appears as a current canonical number, which is itself an artifact rather than a finding. A single text-substitution pass across the four user-facing surfaces above at build time would close this.</w:t>
+        <w:t>Dashboards/Clinical_Trial_Dashboard.html prose — '748+ diabetes clinical trials' (stale; was stale at 748+ last week too)</w:t>
+      </w:r>
+    </w:p>
+    <w:p>
+      <w:r>
+        <w:t>Dashboards/Gap_Deep_Dives.html — three occurrences of '746' (stale)</w:t>
+      </w:r>
+    </w:p>
+    <w:p>
+      <w:r>
+        <w:t>docs/social_media_launch_posts.md — five occurrences of '746' (stale)</w:t>
+      </w:r>
+    </w:p>
+    <w:p>
+      <w:r>
+        <w:t>The audit task description itself still references 746 trials — this is now four audit cycles out of date and should be removed from the task description, or the description should be reworded to 'whatever the current canonical figure is'. Until a single source-of-truth is wired in at build time, every weekly audit will keep re-flagging the same four surfaces.</w:t>
       </w:r>
     </w:p>
     <w:p>
       <w:pPr>
         <w:pStyle w:val="Heading3"/>
-        <w:spacing w:before="200"/>
       </w:pPr>
       <w:r>
+        <w:rPr>
+          <w:rFonts w:ascii="Georgia" w:hAnsi="Georgia"/>
+          <w:color w:val="1A1A1A"/>
+        </w:rPr>
         <w:t>Upcoming / in-progress items</w:t>
       </w:r>
     </w:p>
     <w:p>
       <w:r>
-        <w:rPr>
-          <w:b w:val="0"/>
-          <w:i w:val="0"/>
-        </w:rPr>
-        <w:t>The landing page carries an "In Progress &amp; Upcoming" section with three cards. None carry deadlines; none are past due. The Completed card ("BRONZE-to-SILVER Gap Promotion") has now been in place across four audit cycles and could be rotated out.</w:t>
+        <w:t>The landing page carries an 'In Progress &amp; Upcoming' section with three cards: Multi-Omics Biomarker Integration (In Progress), Pressure Test: LADA Model + Trial Mapper (In Progress), and BRONZE-to-SILVER Gap Promotion (Completed). None carry deadlines; none are past due. The Completed card has been in place across five audit cycles now and is starting to look like permanent furniture rather than recent news — consider rotating it out or moving it to a 'Recent Milestones' section.</w:t>
       </w:r>
     </w:p>
     <w:p>
       <w:pPr>
         <w:pStyle w:val="Heading2"/>
-        <w:spacing w:before="280"/>
       </w:pPr>
       <w:r>
+        <w:rPr>
+          <w:rFonts w:ascii="Georgia" w:hAnsi="Georgia"/>
+          <w:color w:val="1A1A1A"/>
+        </w:rPr>
         <w:t>5. Accessibility and Inclusivity</w:t>
       </w:r>
     </w:p>
     <w:p>
       <w:pPr>
         <w:pStyle w:val="Heading3"/>
-        <w:spacing w:before="200"/>
       </w:pPr>
       <w:r>
+        <w:rPr>
+          <w:rFonts w:ascii="Georgia" w:hAnsi="Georgia"/>
+          <w:color w:val="1A1A1A"/>
+        </w:rPr>
         <w:t>Colour contrast</w:t>
       </w:r>
     </w:p>
-    <w:tbl>
-      <w:tblPr>
-        <w:tblStyle w:val="LightGrid-Accent1"/>
-        <w:tblW w:type="auto" w:w="0"/>
-        <w:tblLook w:firstColumn="1" w:firstRow="1" w:lastColumn="0" w:lastRow="0" w:noHBand="0" w:noVBand="1" w:val="04A0"/>
-      </w:tblPr>
-      <w:tblGrid>
-        <w:gridCol w:w="3120"/>
-        <w:gridCol w:w="3120"/>
-        <w:gridCol w:w="3120"/>
-      </w:tblGrid>
-      <w:tr>
-        <w:tc>
-          <w:tcPr>
-            <w:tcW w:type="dxa" w:w="3120"/>
-          </w:tcPr>
-          <w:p>
-            <w:r>
-              <w:t>Token</w:t>
-            </w:r>
-          </w:p>
-        </w:tc>
-        <w:tc>
-          <w:tcPr>
-            <w:tcW w:type="dxa" w:w="3120"/>
-          </w:tcPr>
-          <w:p>
-            <w:r>
-              <w:t>Ratio on #FAFAF7</w:t>
-            </w:r>
-          </w:p>
-        </w:tc>
-        <w:tc>
-          <w:tcPr>
-            <w:tcW w:type="dxa" w:w="3120"/>
-          </w:tcPr>
-          <w:p>
-            <w:r>
-              <w:t>WCAG status</w:t>
-            </w:r>
-          </w:p>
-        </w:tc>
-      </w:tr>
-      <w:tr>
-        <w:tc>
-          <w:tcPr>
-            <w:tcW w:type="dxa" w:w="3120"/>
-          </w:tcPr>
-          <w:p>
-            <w:r>
-              <w:rPr>
-                <w:sz w:val="19"/>
-              </w:rPr>
-              <w:t>--text #1A1A1A</w:t>
-            </w:r>
-          </w:p>
-        </w:tc>
-        <w:tc>
-          <w:tcPr>
-            <w:tcW w:type="dxa" w:w="3120"/>
-          </w:tcPr>
-          <w:p>
-            <w:r>
-              <w:rPr>
-                <w:sz w:val="19"/>
-              </w:rPr>
-              <w:t>16.64 : 1</w:t>
-            </w:r>
-          </w:p>
-        </w:tc>
-        <w:tc>
-          <w:tcPr>
-            <w:tcW w:type="dxa" w:w="3120"/>
-          </w:tcPr>
-          <w:p>
-            <w:r>
-              <w:rPr>
-                <w:sz w:val="19"/>
-              </w:rPr>
-              <w:t>AA PASS, AAA PASS</w:t>
-            </w:r>
-          </w:p>
-        </w:tc>
-      </w:tr>
-      <w:tr>
-        <w:tc>
-          <w:tcPr>
-            <w:tcW w:type="dxa" w:w="3120"/>
-          </w:tcPr>
-          <w:p>
-            <w:r>
-              <w:rPr>
-                <w:sz w:val="19"/>
-              </w:rPr>
-              <w:t>--muted #636363</w:t>
-            </w:r>
-          </w:p>
-        </w:tc>
-        <w:tc>
-          <w:tcPr>
-            <w:tcW w:type="dxa" w:w="3120"/>
-          </w:tcPr>
-          <w:p>
-            <w:r>
-              <w:rPr>
-                <w:sz w:val="19"/>
-              </w:rPr>
-              <w:t>5.75 : 1</w:t>
-            </w:r>
-          </w:p>
-        </w:tc>
-        <w:tc>
-          <w:tcPr>
-            <w:tcW w:type="dxa" w:w="3120"/>
-          </w:tcPr>
-          <w:p>
-            <w:r>
-              <w:rPr>
-                <w:sz w:val="19"/>
-              </w:rPr>
-              <w:t>AA PASS, AAA FAIL (target 7:1)</w:t>
-            </w:r>
-          </w:p>
-        </w:tc>
-      </w:tr>
-      <w:tr>
-        <w:tc>
-          <w:tcPr>
-            <w:tcW w:type="dxa" w:w="3120"/>
-          </w:tcPr>
-          <w:p>
-            <w:r>
-              <w:rPr>
-                <w:sz w:val="19"/>
-              </w:rPr>
-              <w:t>--light #999999</w:t>
-            </w:r>
-          </w:p>
-        </w:tc>
-        <w:tc>
-          <w:tcPr>
-            <w:tcW w:type="dxa" w:w="3120"/>
-          </w:tcPr>
-          <w:p>
-            <w:r>
-              <w:rPr>
-                <w:sz w:val="19"/>
-              </w:rPr>
-              <w:t>2.72 : 1</w:t>
-            </w:r>
-          </w:p>
-        </w:tc>
-        <w:tc>
-          <w:tcPr>
-            <w:tcW w:type="dxa" w:w="3120"/>
-          </w:tcPr>
-          <w:p>
-            <w:r>
-              <w:rPr>
-                <w:sz w:val="19"/>
-              </w:rPr>
-              <w:t>AA FAIL for normal and large text</w:t>
-            </w:r>
-          </w:p>
-        </w:tc>
-      </w:tr>
-    </w:tbl>
     <w:p>
       <w:r>
-        <w:rPr>
-          <w:b w:val="0"/>
-          <w:i w:val="0"/>
-        </w:rPr>
-        <w:t>The --muted token used for body-level secondary text passes WCAG AA. A one-step darken to #5A5A5A would lift it to 6.60 : 1 and close most of the AAA gap without changing the visual character of the Tufte palette. --light continues to fail and should not carry semantic text — observed usage is confined to dot leaders and rules, which is acceptable.</w:t>
+        <w:t>The --muted token (#636363) on the --bg surface (#fafaf7) yields a contrast ratio of 5.75 : 1, which passes WCAG AA for normal body text (4.5 : 1) but falls short of AAA (7 : 1). The --light token (#999999) on the same background yields 2.72 : 1, which fails AA for normal text. Observed usage of --light is confined to decorative dot leaders and rules — no semantic text is bound to it — so the failing ratio does not break compliance, but the binding should be enforced by convention rather than discipline. Recommendation: darken --muted to #5A5A5A (6.60 : 1) per prior audits; restrict --light to decorative use by convention or rename it to --light-decorative.</w:t>
       </w:r>
     </w:p>
     <w:p>
       <w:pPr>
         <w:pStyle w:val="Heading3"/>
-        <w:spacing w:before="200"/>
       </w:pPr>
       <w:r>
+        <w:rPr>
+          <w:rFonts w:ascii="Georgia" w:hAnsi="Georgia"/>
+          <w:color w:val="1A1A1A"/>
+        </w:rPr>
         <w:t>ARIA coverage</w:t>
       </w:r>
     </w:p>
     <w:p>
       <w:r>
-        <w:rPr>
-          <w:b w:val="0"/>
-          <w:i w:val="0"/>
-        </w:rPr>
-        <w:t>ARIA attribute density is consistent across dashboards: 2 to 4 aria-* attributes per dashboard (typical pattern is aria-label on the tab list plus aria-expanded/aria-controls on collapsible sections). No dashboard is below the platform's documented minimum. Recent post-processing logs confirm "ARIA labels" was applied across all 34 dashboards this build.</w:t>
+        <w:t>ARIA attribute density across the working copy ranges from 8 to 10 aria-* attributes per dashboard, with the typical pattern being aria-label on the tab list, aria-expanded / aria-controls on collapsible sections, and aria-haspopup / aria-label on the new drh-nav grouped dropdown. No dashboard falls below the platform's documented minimum. Post-processing log this cycle confirms 'ARIA labels' applied to all 34 dashboards. The deployed mirror has none of this — see Section 1.</w:t>
       </w:r>
     </w:p>
     <w:p>
       <w:pPr>
         <w:pStyle w:val="Heading3"/>
-        <w:spacing w:before="200"/>
       </w:pPr>
       <w:r>
+        <w:rPr>
+          <w:rFonts w:ascii="Georgia" w:hAnsi="Georgia"/>
+          <w:color w:val="1A1A1A"/>
+        </w:rPr>
         <w:t>Table header markup</w:t>
       </w:r>
     </w:p>
     <w:p>
       <w:r>
-        <w:rPr>
-          <w:b w:val="0"/>
-          <w:i w:val="0"/>
-        </w:rPr>
-        <w:t>0 of 481 &lt;th&gt; elements across the working copy carry scope="col" or scope="row". Long-standing platform-wide LOW finding, unchanged from prior audits.</w:t>
+        <w:t>0 of 465 &lt;th&gt; elements across the working copy carry scope="col" or scope="row". Long-standing platform-wide LOW finding, unchanged from prior audits. Fix is a single postprocess pass that walks every &lt;th&gt; and inserts scope based on parent row position; the post-processing infrastructure already exists for this.</w:t>
       </w:r>
     </w:p>
     <w:p>
       <w:r>
-        <w:rPr>
-          <w:b w:val="0"/>
-          <w:i w:val="0"/>
-        </w:rPr>
-        <w:t>Three dashboards have one or more &lt;table&gt; elements with no &lt;thead&gt; at all: GKA_Pricing.html (4 of 4 tables), LADA_Prevalence.html (2 of 2 tables), and Treg_Neuropathy.html (2 of 2 tables). Extracted_Evidence.html has 12 of 15 tables without &lt;thead&gt;. These are likely runtime-rendered tables emitted by JavaScript that drops &lt;thead&gt; wrapping. Fix is either in the template emit path or as a one-shot postprocess step in postprocess_dashboards.py.</w:t>
+        <w:t>Three dashboards still emit one or more &lt;table&gt; elements with no &lt;thead&gt;: GKA_Pricing.html (4 of 4 tables), LADA_Prevalence.html (2 of 2), Treg_Neuropathy.html (2 of 2). Extracted_Evidence.html has 12 of 15 tables without &lt;thead&gt;. These are runtime-rendered tables from JavaScript that drops the &lt;thead&gt; wrapping. Fix is either in the JS emit path or as a one-shot postprocess step in postprocess_dashboards.py.</w:t>
       </w:r>
     </w:p>
     <w:p>
       <w:pPr>
         <w:pStyle w:val="Heading2"/>
-        <w:spacing w:before="280"/>
       </w:pPr>
       <w:r>
+        <w:rPr>
+          <w:rFonts w:ascii="Georgia" w:hAnsi="Georgia"/>
+          <w:color w:val="1A1A1A"/>
+        </w:rPr>
         <w:t>6. Collaboration Infrastructure</w:t>
       </w:r>
     </w:p>
-    <w:tbl>
-      <w:tblPr>
-        <w:tblStyle w:val="LightGrid-Accent1"/>
-        <w:tblW w:type="auto" w:w="0"/>
-        <w:tblLook w:firstColumn="1" w:firstRow="1" w:lastColumn="0" w:lastRow="0" w:noHBand="0" w:noVBand="1" w:val="04A0"/>
-      </w:tblPr>
-      <w:tblGrid>
-        <w:gridCol w:w="4680"/>
-        <w:gridCol w:w="4680"/>
-      </w:tblGrid>
-      <w:tr>
-        <w:tc>
-          <w:tcPr>
-            <w:tcW w:type="dxa" w:w="4680"/>
-          </w:tcPr>
-          <w:p>
-            <w:r>
-              <w:t>Item</w:t>
-            </w:r>
-          </w:p>
-        </w:tc>
-        <w:tc>
-          <w:tcPr>
-            <w:tcW w:type="dxa" w:w="4680"/>
-          </w:tcPr>
-          <w:p>
-            <w:r>
-              <w:t>Status</w:t>
-            </w:r>
-          </w:p>
-        </w:tc>
-      </w:tr>
-      <w:tr>
-        <w:tc>
-          <w:tcPr>
-            <w:tcW w:type="dxa" w:w="4680"/>
-          </w:tcPr>
-          <w:p>
-            <w:r>
-              <w:rPr>
-                <w:sz w:val="19"/>
-              </w:rPr>
-              <w:t>CONTRIBUTING.md</w:t>
-            </w:r>
-          </w:p>
-        </w:tc>
-        <w:tc>
-          <w:tcPr>
-            <w:tcW w:type="dxa" w:w="4680"/>
-          </w:tcPr>
-          <w:p>
-            <w:r>
-              <w:rPr>
-                <w:sz w:val="19"/>
-              </w:rPr>
-              <w:t>Present, 3.4 KB. Covers data-error reporting, new-gap suggestions, dashboard improvements, GOLD/SILVER/BRONZE validation hierarchy.</w:t>
-            </w:r>
-          </w:p>
-        </w:tc>
-      </w:tr>
-      <w:tr>
-        <w:tc>
-          <w:tcPr>
-            <w:tcW w:type="dxa" w:w="4680"/>
-          </w:tcPr>
-          <w:p>
-            <w:r>
-              <w:rPr>
-                <w:sz w:val="19"/>
-              </w:rPr>
-              <w:t>Citation format</w:t>
-            </w:r>
-          </w:p>
-        </w:tc>
-        <w:tc>
-          <w:tcPr>
-            <w:tcW w:type="dxa" w:w="4680"/>
-          </w:tcPr>
-          <w:p>
-            <w:r>
-              <w:rPr>
-                <w:sz w:val="19"/>
-              </w:rPr>
-              <w:t>Present in CONTRIBUTING.md (APA + BibTeX under "Citing This Work"). Links OSF preregistration https://osf.io/hu9ga.</w:t>
-            </w:r>
-          </w:p>
-        </w:tc>
-      </w:tr>
-      <w:tr>
-        <w:tc>
-          <w:tcPr>
-            <w:tcW w:type="dxa" w:w="4680"/>
-          </w:tcPr>
-          <w:p>
-            <w:r>
-              <w:rPr>
-                <w:sz w:val="19"/>
-              </w:rPr>
-              <w:t>GitHub issue templates</w:t>
-            </w:r>
-          </w:p>
-        </w:tc>
-        <w:tc>
-          <w:tcPr>
-            <w:tcW w:type="dxa" w:w="4680"/>
-          </w:tcPr>
-          <w:p>
-            <w:r>
-              <w:rPr>
-                <w:sz w:val="19"/>
-              </w:rPr>
-              <w:t>Present, 4 templates (bug_report.md, data_error.md, feature_request.md, new_gap.md). Each maps to a labelled flow in CONTRIBUTING.md.</w:t>
-            </w:r>
-          </w:p>
-        </w:tc>
-      </w:tr>
-      <w:tr>
-        <w:tc>
-          <w:tcPr>
-            <w:tcW w:type="dxa" w:w="4680"/>
-          </w:tcPr>
-          <w:p>
-            <w:r>
-              <w:rPr>
-                <w:sz w:val="19"/>
-              </w:rPr>
-              <w:t>CITATION.cff</w:t>
-            </w:r>
-          </w:p>
-        </w:tc>
-        <w:tc>
-          <w:tcPr>
-            <w:tcW w:type="dxa" w:w="4680"/>
-          </w:tcPr>
-          <w:p>
-            <w:r>
-              <w:rPr>
-                <w:sz w:val="19"/>
-              </w:rPr>
-              <w:t>MISSING. GitHub renders a "Cite this repository" button when present at repo root. Carryover finding.</w:t>
-            </w:r>
-          </w:p>
-        </w:tc>
-      </w:tr>
-      <w:tr>
-        <w:tc>
-          <w:tcPr>
-            <w:tcW w:type="dxa" w:w="4680"/>
-          </w:tcPr>
-          <w:p>
-            <w:r>
-              <w:rPr>
-                <w:sz w:val="19"/>
-              </w:rPr>
-              <w:t>Pull request template</w:t>
-            </w:r>
-          </w:p>
-        </w:tc>
-        <w:tc>
-          <w:tcPr>
-            <w:tcW w:type="dxa" w:w="4680"/>
-          </w:tcPr>
-          <w:p>
-            <w:r>
-              <w:rPr>
-                <w:sz w:val="19"/>
-              </w:rPr>
-              <w:t>MISSING. No .github/PULL_REQUEST_TEMPLATE.md.</w:t>
-            </w:r>
-          </w:p>
-        </w:tc>
-      </w:tr>
-      <w:tr>
-        <w:tc>
-          <w:tcPr>
-            <w:tcW w:type="dxa" w:w="4680"/>
-          </w:tcPr>
-          <w:p>
-            <w:r>
-              <w:rPr>
-                <w:sz w:val="19"/>
-              </w:rPr>
-              <w:t>CI workflow</w:t>
-            </w:r>
-          </w:p>
-        </w:tc>
-        <w:tc>
-          <w:tcPr>
-            <w:tcW w:type="dxa" w:w="4680"/>
-          </w:tcPr>
-          <w:p>
-            <w:r>
-              <w:rPr>
-                <w:sz w:val="19"/>
-              </w:rPr>
-              <w:t>MISSING. .github/workflows/ does not exist. A minimal workflow running py_compile across Analysis/Scripts/ plus a docs-mirror link check would have caught both this week's add_citations.py failure and the carryover Islet mirror gap automatically.</w:t>
-            </w:r>
-          </w:p>
-        </w:tc>
-      </w:tr>
-    </w:tbl>
+    <w:p>
+      <w:r>
+        <w:t>CONTRIBUTING.md is present at the repo root, 3.4 KB, last modified 2026-03-16. It covers data error reporting, new-gap submission, dashboard improvements, and includes an APA citation and BibTeX block under 'Citing This Work'. Unchanged since prior audits.</w:t>
+      </w:r>
+    </w:p>
+    <w:p>
+      <w:r>
+        <w:t>.github/ISSUE_TEMPLATE/ contains four templates: bug_report.md, data_error.md, feature_request.md, new_gap.md. All present and unchanged. No pull request template (.github/PULL_REQUEST_TEMPLATE.md does not exist) — minor gap but contributors are currently directed through issues rather than PRs.</w:t>
+      </w:r>
+    </w:p>
+    <w:p>
+      <w:r>
+        <w:t>CITATION.cff is still absent at the repo root — carryover LOW from prior audits. A 12-line file mirroring the APA citation already in CONTRIBUTING.md would enable GitHub's 'Cite this repository' button on the repo home page. codemeta.json is also absent.</w:t>
+      </w:r>
+    </w:p>
+    <w:p>
+      <w:r>
+        <w:br w:type="page"/>
+      </w:r>
+    </w:p>
     <w:p>
       <w:pPr>
         <w:pStyle w:val="Heading1"/>
       </w:pPr>
       <w:r>
+        <w:rPr>
+          <w:rFonts w:ascii="Georgia" w:hAnsi="Georgia"/>
+          <w:color w:val="1A1A1A"/>
+        </w:rPr>
         <w:t>Priority Action Items</w:t>
       </w:r>
     </w:p>
     <w:p>
       <w:pPr>
         <w:pStyle w:val="Heading2"/>
-        <w:spacing w:before="280"/>
       </w:pPr>
       <w:r>
+        <w:rPr>
+          <w:rFonts w:ascii="Georgia" w:hAnsi="Georgia"/>
+          <w:color w:val="1A1A1A"/>
+        </w:rPr>
         <w:t>HIGH</w:t>
       </w:r>
     </w:p>
@@ -4880,16 +4018,12 @@
           <w:b/>
           <w:i w:val="0"/>
         </w:rPr>
-        <w:t xml:space="preserve">1. Repair add_citations.py (NEW). </w:t>
+        <w:t>1. Fix the docs/Dashboards/ deploy step (NEW).</w:t>
       </w:r>
     </w:p>
     <w:p>
       <w:r>
-        <w:rPr>
-          <w:b w:val="0"/>
-          <w:i w:val="0"/>
-        </w:rPr>
-        <w:t>The master runner now fails with IndentationError at line 268 of Analysis/Scripts/add_citations.py on every full build. Lines 267-274 are an orphan duplicate of the closing block already executed inside main(). Deleting those eight lines restores a clean exit. Test: rerun python run_quality_improvements.py; expect the [FAILED] line to clear and the run to exit all-green.</w:t>
+        <w:t>All 33 files in the deployed mirror are dated 2026-03-29, predating the drh-nav post-processing step and every PMID hyperlink injection since. None of the working-copy improvements of the past two months are visible on the GitHub Pages site. refresh_hub.py contains no docs/ sync. The fix is to add a sync step to the deploy pipeline — concretely, after the post-processing run in run_quality_improvements.py, copy every Dashboards/*.html → docs/Dashboards/*.html (and ensure Islet_Drug_Repurposing.html is included). Test: timestamp on docs/Dashboards/Acronym_Database.html should move forward to today's date; drh-nav class should appear in all 34 mirror files.</w:t>
       </w:r>
     </w:p>
     <w:p>
@@ -4898,24 +4032,23 @@
           <w:b/>
           <w:i w:val="0"/>
         </w:rPr>
-        <w:t xml:space="preserve">2. Mirror Dashboards/Islet_Drug_Repurposing.html to docs/Dashboards/ (carryover, 3rd cycle). </w:t>
+        <w:t>2. Mirror Dashboards/Islet_Drug_Repurposing.html to docs/Dashboards/ (carryover, 4th cycle).</w:t>
       </w:r>
     </w:p>
     <w:p>
       <w:r>
-        <w:rPr>
-          <w:b w:val="0"/>
-          <w:i w:val="0"/>
-        </w:rPr>
-        <w:t>Landing page links to a dashboard the GitHub Pages mirror does not contain. Visitors see 404 on the "Islet Drug Repurposing Pipeline" card. One-line fix in the deploy step (cp Dashboards/Islet_Drug_Repurposing.html docs/Dashboards/) plus commit. Recommended: add this check to a CI workflow so the gap surfaces on PR rather than weekly audit.</w:t>
+        <w:t>This is a subset of (1) above — once the deploy step is fixed, this finding closes automatically. Until then, visitors see 404 on the 'Islet Drug Repurposing Pipeline' card from the landing page. Working copy at 115.6 KB has complete nav/back/PMID markup.</w:t>
       </w:r>
     </w:p>
     <w:p>
       <w:pPr>
         <w:pStyle w:val="Heading2"/>
-        <w:spacing w:before="280"/>
       </w:pPr>
       <w:r>
+        <w:rPr>
+          <w:rFonts w:ascii="Georgia" w:hAnsi="Georgia"/>
+          <w:color w:val="1A1A1A"/>
+        </w:rPr>
         <w:t>MEDIUM</w:t>
       </w:r>
     </w:p>
@@ -4925,16 +4058,12 @@
           <w:b/>
           <w:i w:val="0"/>
         </w:rPr>
-        <w:t xml:space="preserve">3. Eliminate trial-count drift across user-facing surfaces (carryover). </w:t>
+        <w:t>3. Eliminate trial-count drift across user-facing surfaces (carryover).</w:t>
       </w:r>
     </w:p>
     <w:p>
       <w:r>
-        <w:rPr>
-          <w:b w:val="0"/>
-          <w:i w:val="0"/>
-        </w:rPr>
-        <w:t>Today's canonical count is 797. The four surfaces that disagree (Clinical_Trial_Dashboard.html prose, Gap_Deep_Dives.html prose lines 2231 and 2299, docs/social_media_launch_posts.md) should be wired to read from the same source as the landing page. Until that single source-of-truth is in place, every audit will keep flagging the same drift.</w:t>
+        <w:t>Today's canonical count is 804. Disagreeing surfaces: Clinical_Trial_Dashboard.html prose ('748+'), Gap_Deep_Dives.html (three '746' occurrences), docs/social_media_launch_posts.md (five '746' occurrences). All four should read from the same source-of-truth as the landing page — concretely, the trial count produced by baseline_clinical_trials.py and stored in clinical_trials_latest.json. Until that wiring is in place, every weekly audit will keep flagging the same drift.</w:t>
       </w:r>
     </w:p>
     <w:p>
@@ -4943,16 +4072,12 @@
           <w:b/>
           <w:i w:val="0"/>
         </w:rPr>
-        <w:t xml:space="preserve">4. Fix the 7 sentence-as-PMID hrefs in Drug_Repurposing_Islet.html (carryover). </w:t>
+        <w:t>4. Fix the 7 sentence-as-PMID hrefs in Drug_Repurposing_Islet.html (carryover, 4th cycle).</w:t>
       </w:r>
     </w:p>
     <w:p>
       <w:r>
-        <w:rPr>
-          <w:b w:val="0"/>
-          <w:i w:val="0"/>
-        </w:rPr>
-        <w:t>Each href currently points to https://pubmed.ncbi.nlm.nih.gov/&lt;a sentence&gt;. Replace each with the actual PMID (preferred) or remove the hyperlink wrapper and leave the annotation as plain text. The underlying issue is in build_drug_repurposing_islet.py, which appears to be passing free-text where it expects a numeric ID.</w:t>
+        <w:t>Each href currently points to https://pubmed.ncbi.nlm.nih.gov/&lt;a sentence&gt;. Replace each with the actual PMID (preferred) or remove the hyperlink wrapper and leave the annotation as plain text. The underlying issue is in build_drug_repurposing_islet.py, which is routing free-text into the same template slot used for numeric PMIDs.</w:t>
       </w:r>
     </w:p>
     <w:p>
@@ -4961,24 +4086,37 @@
           <w:b/>
           <w:i w:val="0"/>
         </w:rPr>
-        <w:t xml:space="preserve">5. Fix the JavaScript template-literal leak in Generic_Drug_Catalog.html (carryover). </w:t>
+        <w:t>5. Fix the JavaScript template-literal leak in Generic_Drug_Catalog.html (carryover, 4th cycle).</w:t>
+      </w:r>
+    </w:p>
+    <w:p>
+      <w:r>
+        <w:t>Two static href values contain pubmed.ncbi.nlm.nih.gov/' + p.trim() + '/ — the template literal was concatenated as a string instead of interpolated. Works at runtime; trips every static scanner and any link-checker.</w:t>
       </w:r>
     </w:p>
     <w:p>
       <w:r>
         <w:rPr>
-          <w:b w:val="0"/>
+          <w:b/>
           <w:i w:val="0"/>
         </w:rPr>
-        <w:t>Two static href values contain pubmed.ncbi.nlm.nih.gov/' + p.trim() + '/ — the template literal was concatenated as a string instead of interpolated. Works at runtime; trips every static scanner and any link-checker.</w:t>
+        <w:t>6. Update the audit task description (NEW housekeeping).</w:t>
+      </w:r>
+    </w:p>
+    <w:p>
+      <w:r>
+        <w:t>The task description references '746 trials' as a number worth refreshing. The canonical figure has been &gt; 746 for at least four audit cycles (was 795 on May 17, 797 on May 24, 804 today). Either remove the number from the prompt or reword to 'whatever the current canonical figure is in Analysis/Results/clinical_trials_latest.json'.</w:t>
       </w:r>
     </w:p>
     <w:p>
       <w:pPr>
         <w:pStyle w:val="Heading2"/>
-        <w:spacing w:before="280"/>
       </w:pPr>
       <w:r>
+        <w:rPr>
+          <w:rFonts w:ascii="Georgia" w:hAnsi="Georgia"/>
+          <w:color w:val="1A1A1A"/>
+        </w:rPr>
         <w:t>LOW — platform-wide hygiene</w:t>
       </w:r>
     </w:p>
@@ -4988,16 +4126,12 @@
           <w:b/>
           <w:i w:val="0"/>
         </w:rPr>
-        <w:t xml:space="preserve">6. Inject scope="col" / scope="row" on every &lt;th&gt; (carryover). </w:t>
+        <w:t>7. Inject scope="col" / scope="row" on every &lt;th&gt; (carryover).</w:t>
       </w:r>
     </w:p>
     <w:p>
       <w:r>
-        <w:rPr>
-          <w:b w:val="0"/>
-          <w:i w:val="0"/>
-        </w:rPr>
-        <w:t>481 of 481 &lt;th&gt; elements lack scope attributes. Closing this is a single postprocess pass that walks every &lt;th&gt; and inserts the appropriate scope based on parent row position.</w:t>
+        <w:t>465 of 465 &lt;th&gt; elements lack scope attributes. Single postprocess pass that walks every &lt;th&gt; and inserts the appropriate scope based on parent row position. Pattern already exists in postprocess_dashboards.py for nav and ARIA.</w:t>
       </w:r>
     </w:p>
     <w:p>
@@ -5006,15 +4140,11 @@
           <w:b/>
           <w:i w:val="0"/>
         </w:rPr>
-        <w:t xml:space="preserve">7. Wrap orphan &lt;table&gt; bodies in &lt;thead&gt; (carryover). </w:t>
+        <w:t>8. Wrap orphan &lt;table&gt; bodies in &lt;thead&gt; (carryover).</w:t>
       </w:r>
     </w:p>
     <w:p>
       <w:r>
-        <w:rPr>
-          <w:b w:val="0"/>
-          <w:i w:val="0"/>
-        </w:rPr>
         <w:t>GKA_Pricing (4), LADA_Prevalence (2), Treg_Neuropathy (2), and Extracted_Evidence (12 of 15) emit tables without &lt;thead&gt;. Either teach the JS emitter to wrap header rows or run the same postprocess pass to add &lt;thead&gt; before deploy.</w:t>
       </w:r>
     </w:p>
@@ -5024,16 +4154,12 @@
           <w:b/>
           <w:i w:val="0"/>
         </w:rPr>
-        <w:t xml:space="preserve">8. Add CITATION.cff at the repo root (carryover). </w:t>
+        <w:t>9. Add CITATION.cff at the repo root (carryover).</w:t>
       </w:r>
     </w:p>
     <w:p>
       <w:r>
-        <w:rPr>
-          <w:b w:val="0"/>
-          <w:i w:val="0"/>
-        </w:rPr>
-        <w:t>12-line file mirroring the APA citation already in CONTRIBUTING.md. Enables GitHub's "Cite this repository" button on the repo home page.</w:t>
+        <w:t>12-line file mirroring the APA citation already in CONTRIBUTING.md. Enables GitHub's 'Cite this repository' button on the repo home page. The text is already written; it just needs to be saved in the correct file with the correct schema.</w:t>
       </w:r>
     </w:p>
     <w:p>
@@ -5042,16 +4168,12 @@
           <w:b/>
           <w:i w:val="0"/>
         </w:rPr>
-        <w:t xml:space="preserve">9. Add a minimal CI workflow (carryover). </w:t>
+        <w:t>10. Add a minimal CI workflow (carryover).</w:t>
       </w:r>
     </w:p>
     <w:p>
       <w:r>
-        <w:rPr>
-          <w:b w:val="0"/>
-          <w:i w:val="0"/>
-        </w:rPr>
-        <w:t>python -m py_compile across Analysis/Scripts/*.py plus a check that every &lt;href&gt; in docs/index.html resolves to a file in docs/Dashboards/. Would have caught both this week's add_citations.py regression and the persistent Islet_Drug_Repurposing mirror gap automatically.</w:t>
+        <w:t>python -m py_compile across Analysis/Scripts/*.py plus a check that every &lt;href&gt; in docs/index.html resolves to a file in docs/Dashboards/. Would have caught (a) last week's add_citations.py regression on PR rather than weekly audit, (b) this week's mirror-staleness finding on the very first PR after the deploy step broke. A 30-line GitHub Actions workflow is sufficient.</w:t>
       </w:r>
     </w:p>
     <w:p>
@@ -5060,16 +4182,12 @@
           <w:b/>
           <w:i w:val="0"/>
         </w:rPr>
-        <w:t xml:space="preserve">10. Replace the hardcoded "Generated 2025" footer in build_gka_landscape.py (carryover). </w:t>
+        <w:t>11. Replace the hardcoded "Generated 2025" footer in build_gka_landscape.py (carryover).</w:t>
       </w:r>
     </w:p>
     <w:p>
       <w:r>
-        <w:rPr>
-          <w:b w:val="0"/>
-          <w:i w:val="0"/>
-        </w:rPr>
-        <w:t>Every other build script writes the current date at footer-render time; this one is a literal at line 1275 of the rendered output. One-line fix to use datetime.date.today().year.</w:t>
+        <w:t>Every other build script writes the current date at footer-render time. This one is a literal at the footer template in build_gka_landscape.py. One-line fix: datetime.date.today().year.</w:t>
       </w:r>
     </w:p>
     <w:p>
@@ -5078,15 +4196,11 @@
           <w:b/>
           <w:i w:val="0"/>
         </w:rPr>
-        <w:t xml:space="preserve">11. Darken --muted from #636363 to #5A5A5A (carryover). </w:t>
+        <w:t>12. Darken --muted from #636363 to #5A5A5A (carryover).</w:t>
       </w:r>
     </w:p>
     <w:p>
       <w:r>
-        <w:rPr>
-          <w:b w:val="0"/>
-          <w:i w:val="0"/>
-        </w:rPr>
         <w:t>Lifts contrast from 5.75 : 1 to 6.60 : 1. Approaches WCAG AAA without changing the visual character of the Tufte palette.</w:t>
       </w:r>
     </w:p>
@@ -5095,22 +4209,21 @@
         <w:pStyle w:val="Heading1"/>
       </w:pPr>
       <w:r>
+        <w:rPr>
+          <w:rFonts w:ascii="Georgia" w:hAnsi="Georgia"/>
+          <w:color w:val="1A1A1A"/>
+        </w:rPr>
         <w:t>Audit Methodology</w:t>
       </w:r>
     </w:p>
     <w:p>
       <w:r>
-        <w:rPr>
-          <w:b w:val="0"/>
-          <w:i/>
-          <w:color w:val="636363"/>
-        </w:rPr>
-        <w:t>Combined static scan and one live execution of the master pipeline. The auditor inspected file contents in Dashboards/ and docs/, regex-matched PMIDs and href patterns, ran py_compile across Analysis/Scripts/, executed python run_quality_improvements.py end-to-end (which surfaced the add_citations.py failure), and compared counts and findings against the prior week's audit report (Platform_Audit_Report.docx dated May 17, 2026). Link existence is checked against the local working copy and mirror; no external HTTP fetch to PubMed was performed. Findings flagged HIGH or MEDIUM are issues that either break user-visible links, fail the master pipeline, or have carried across at least two audit cycles.</w:t>
+        <w:t>Combined static scan and one live execution of the master pipeline. The auditor inspected file contents in Dashboards/ and docs/Dashboards/, regex-matched PMIDs and href patterns, ran py_compile across Analysis/Scripts/, executed python run_quality_improvements.py end-to-end (which exited all-green this cycle), and compared counts and findings against the May 24, 2026 Platform_Audit_Report.docx. Link existence was checked against the local working copy and mirror; no external HTTP fetch to PubMed was performed. Findings flagged HIGH or MEDIUM are issues that either break user-visible links, fail the master pipeline, or have carried across at least two audit cycles.</w:t>
       </w:r>
     </w:p>
     <w:sectPr>
       <w:pgSz w:w="12240" w:h="15840"/>
-      <w:pgMar w:top="1296" w:right="1440" w:bottom="1296" w:left="1440" w:header="720" w:footer="720" w:gutter="0"/>
+      <w:pgMar w:top="1440" w:right="1440" w:bottom="1440" w:left="1440" w:header="720" w:footer="720" w:gutter="0"/>
       <w:cols w:space="720"/>
       <w:docGrid w:linePitch="360"/>
     </w:sectPr>
@@ -5481,12 +4594,9 @@
     <w:name w:val="Normal"/>
     <w:qFormat/>
     <w:rsid w:val="00FC693F"/>
-    <w:pPr>
-      <w:spacing w:after="120"/>
-    </w:pPr>
     <w:rPr>
       <w:rFonts w:ascii="Calibri" w:hAnsi="Calibri"/>
-      <w:sz w:val="21"/>
+      <w:sz w:val="22"/>
     </w:rPr>
   </w:style>
   <w:style w:type="paragraph" w:styleId="Header">
@@ -5548,11 +4658,11 @@
       <w:outlineLvl w:val="0"/>
     </w:pPr>
     <w:rPr>
-      <w:rFonts w:asciiTheme="majorHAnsi" w:eastAsiaTheme="majorEastAsia" w:hAnsiTheme="majorHAnsi" w:cstheme="majorBidi" w:ascii="Calibri" w:hAnsi="Calibri"/>
-      <w:b w:val="0"/>
+      <w:rFonts w:asciiTheme="majorHAnsi" w:eastAsiaTheme="majorEastAsia" w:hAnsiTheme="majorHAnsi" w:cstheme="majorBidi"/>
+      <w:b/>
       <w:bCs/>
-      <w:color w:val="1A1A1A"/>
-      <w:sz w:val="36"/>
+      <w:color w:val="365F91" w:themeColor="accent1" w:themeShade="BF"/>
+      <w:sz w:val="28"/>
       <w:szCs w:val="28"/>
     </w:rPr>
   </w:style>
@@ -5572,10 +4682,10 @@
       <w:outlineLvl w:val="1"/>
     </w:pPr>
     <w:rPr>
-      <w:rFonts w:asciiTheme="majorHAnsi" w:eastAsiaTheme="majorEastAsia" w:hAnsiTheme="majorHAnsi" w:cstheme="majorBidi" w:ascii="Calibri" w:hAnsi="Calibri"/>
+      <w:rFonts w:asciiTheme="majorHAnsi" w:eastAsiaTheme="majorEastAsia" w:hAnsiTheme="majorHAnsi" w:cstheme="majorBidi"/>
       <w:b/>
       <w:bCs/>
-      <w:color w:val="1A1A1A"/>
+      <w:color w:val="4F81BD" w:themeColor="accent1"/>
       <w:sz w:val="26"/>
       <w:szCs w:val="26"/>
     </w:rPr>
@@ -5596,11 +4706,10 @@
       <w:outlineLvl w:val="2"/>
     </w:pPr>
     <w:rPr>
-      <w:rFonts w:asciiTheme="majorHAnsi" w:eastAsiaTheme="majorEastAsia" w:hAnsiTheme="majorHAnsi" w:cstheme="majorBidi" w:ascii="Calibri" w:hAnsi="Calibri"/>
+      <w:rFonts w:asciiTheme="majorHAnsi" w:eastAsiaTheme="majorEastAsia" w:hAnsiTheme="majorHAnsi" w:cstheme="majorBidi"/>
       <w:b/>
       <w:bCs/>
-      <w:color w:val="1A1A1A"/>
-      <w:sz w:val="22"/>
+      <w:color w:val="4F81BD" w:themeColor="accent1"/>
     </w:rPr>
   </w:style>
   <w:style w:type="paragraph" w:styleId="Heading4">

</xml_diff>